<commit_message>
Import ordered point sequences as splines
Co-authored-by: Copilot <223556219+Copilot@users.noreply.github.com>
</commit_message>
<xml_diff>
--- a/docs/MeshCAD_User_Manual.docx
+++ b/docs/MeshCAD_User_Manual.docx
@@ -136,6 +136,18 @@
         <w:rPr>
           <w:sz w:val="18"/>
         </w:rPr>
+        <w:t>Import an Ordered Point Sequence</w:t>
+      </w:r>
+    </w:p>
+    <w:p>
+      <w:pPr>
+        <w:spacing w:after="20"/>
+        <w:ind w:left="317"/>
+      </w:pPr>
+      <w:r>
+        <w:rPr>
+          <w:sz w:val="18"/>
+        </w:rPr>
         <w:t>2. Edit Geometry</w:t>
       </w:r>
     </w:p>
@@ -540,7 +552,7 @@
         <w:t>File menu:</w:t>
       </w:r>
       <w:r>
-        <w:t xml:space="preserve"> New, Open, Save, Save As, Export Mesh (VTK), and Exit.</w:t>
+        <w:t xml:space="preserve"> New, Open, Import Point Sequence, Save, Save As, Export Mesh (VTK), Export Mesh (JSON), and Exit.</w:t>
       </w:r>
     </w:p>
     <w:p>
@@ -899,457 +911,47 @@
         <w:pStyle w:val="Heading2"/>
       </w:pPr>
       <w:r>
-        <w:t>2. Edit Geometry</w:t>
+        <w:t>Import an Ordered Point Sequence</w:t>
       </w:r>
     </w:p>
     <w:p>
       <w:r>
-        <w:t xml:space="preserve">Switch to </w:t>
+        <w:t xml:space="preserve">Choose </w:t>
       </w:r>
       <w:r>
         <w:rPr>
           <w:b/>
         </w:rPr>
-        <w:t>Select</w:t>
-      </w:r>
-      <w:r>
-        <w:t xml:space="preserve"> before editing.</w:t>
+        <w:t>File &gt; Import Point Sequence</w:t>
+      </w:r>
+      <w:r>
+        <w:t xml:space="preserve"> and select a CSV or TXT file containing two comma-separated coordinates per row:</w:t>
       </w:r>
     </w:p>
     <w:p>
       <w:pPr>
-        <w:spacing w:after="60"/>
-        <w:ind w:left="346" w:hanging="346"/>
-      </w:pPr>
-      <w:r>
-        <w:t xml:space="preserve">• </w:t>
-      </w:r>
-      <w:r>
-        <w:t>Drag a red vertex to move every connected edge.</w:t>
+        <w:spacing w:before="60" w:after="120"/>
+        <w:ind w:left="259"/>
+        <w:shd w:fill="F1F5F9"/>
+      </w:pPr>
+      <w:r>
+        <w:rPr>
+          <w:rFonts w:ascii="Cascadia Mono" w:hAnsi="Cascadia Mono"/>
+          <w:color w:val="1E293B"/>
+          <w:sz w:val="17"/>
+        </w:rPr>
+        <w:t>X,Y</w:t>
+        <w:br/>
+        <w:t>0.0,0.0</w:t>
+        <w:br/>
+        <w:t>1.0,0.5</w:t>
+        <w:br/>
+        <w:t>2.0,0.0</w:t>
       </w:r>
     </w:p>
     <w:p>
-      <w:pPr>
-        <w:spacing w:after="60"/>
-        <w:ind w:left="346" w:hanging="346"/>
-      </w:pPr>
-      <w:r>
-        <w:t xml:space="preserve">• </w:t>
-      </w:r>
-      <w:r>
-        <w:t>Drag a blue grip to move an arc center or an internal spline control point.</w:t>
-      </w:r>
-    </w:p>
-    <w:p>
-      <w:pPr>
-        <w:spacing w:after="60"/>
-        <w:ind w:left="346" w:hanging="346"/>
-      </w:pPr>
-      <w:r>
-        <w:t xml:space="preserve">• </w:t>
-      </w:r>
-      <w:r>
-        <w:t>Double-click a vertex or grip to enter exact coordinates.</w:t>
-      </w:r>
-    </w:p>
-    <w:p>
-      <w:pPr>
-        <w:spacing w:after="60"/>
-        <w:ind w:left="346" w:hanging="346"/>
-      </w:pPr>
-      <w:r>
-        <w:t xml:space="preserve">• </w:t>
-      </w:r>
-      <w:r>
-        <w:t>When an arc center is edited, its endpoints remain fixed and the center is constrained to the chord perpendicular bisector.</w:t>
-      </w:r>
-    </w:p>
-    <w:p>
-      <w:pPr>
-        <w:spacing w:after="60"/>
-        <w:ind w:left="346" w:hanging="346"/>
-      </w:pPr>
-      <w:r>
-        <w:t xml:space="preserve">• </w:t>
-      </w:r>
-      <w:r>
-        <w:t>Existing block meshes are regenerated automatically after relevant geometry changes.</w:t>
-      </w:r>
-    </w:p>
-    <w:p>
-      <w:pPr>
-        <w:pStyle w:val="Heading2"/>
-      </w:pPr>
-      <w:r>
-        <w:t>3. Detect a Closed Loop</w:t>
-      </w:r>
-    </w:p>
-    <w:p>
-      <w:r>
-        <w:t xml:space="preserve">In the </w:t>
-      </w:r>
-      <w:r>
-        <w:rPr>
-          <w:b/>
-        </w:rPr>
-        <w:t>Loops</w:t>
-      </w:r>
-      <w:r>
-        <w:t xml:space="preserve"> panel, click </w:t>
-      </w:r>
-      <w:r>
-        <w:rPr>
-          <w:b/>
-        </w:rPr>
-        <w:t>Detect Loops</w:t>
-      </w:r>
-      <w:r>
-        <w:t>. Closed contours are listed. Selecting a loop highlights it in green on the canvas.</w:t>
-      </w:r>
-    </w:p>
-    <w:p>
-      <w:r>
-        <w:t>If no loop is detected:</w:t>
-      </w:r>
-    </w:p>
-    <w:p>
-      <w:pPr>
-        <w:spacing w:after="60"/>
-        <w:ind w:left="346" w:hanging="346"/>
-      </w:pPr>
-      <w:r>
-        <w:t xml:space="preserve">1. </w:t>
-      </w:r>
-      <w:r>
-        <w:t>zoom into every connection;</w:t>
-      </w:r>
-    </w:p>
-    <w:p>
-      <w:pPr>
-        <w:spacing w:after="60"/>
-        <w:ind w:left="346" w:hanging="346"/>
-      </w:pPr>
-      <w:r>
-        <w:t xml:space="preserve">2. </w:t>
-      </w:r>
-      <w:r>
-        <w:t>check for gaps or duplicate endpoints;</w:t>
-      </w:r>
-    </w:p>
-    <w:p>
-      <w:pPr>
-        <w:spacing w:after="60"/>
-        <w:ind w:left="346" w:hanging="346"/>
-      </w:pPr>
-      <w:r>
-        <w:t xml:space="preserve">3. </w:t>
-      </w:r>
-      <w:r>
-        <w:t>use snapping or double-click coordinate editing to make endpoints coincide;</w:t>
-      </w:r>
-    </w:p>
-    <w:p>
-      <w:pPr>
-        <w:spacing w:after="60"/>
-        <w:ind w:left="346" w:hanging="346"/>
-      </w:pPr>
-      <w:r>
-        <w:t xml:space="preserve">4. </w:t>
-      </w:r>
-      <w:r>
-        <w:t xml:space="preserve">run </w:t>
-      </w:r>
-      <w:r>
-        <w:rPr>
-          <w:b/>
-        </w:rPr>
-        <w:t>Detect Loops</w:t>
-      </w:r>
-      <w:r>
-        <w:t xml:space="preserve"> again.</w:t>
-      </w:r>
-    </w:p>
-    <w:p>
-      <w:pPr>
-        <w:pStyle w:val="Heading2"/>
-      </w:pPr>
-      <w:r>
-        <w:t>4. Create a Structured Block</w:t>
-      </w:r>
-    </w:p>
-    <w:p>
-      <w:r>
-        <w:t xml:space="preserve">Select a loop and click </w:t>
-      </w:r>
-      <w:r>
-        <w:rPr>
-          <w:b/>
-        </w:rPr>
-        <w:t>Create Block from Loop</w:t>
-      </w:r>
-      <w:r>
-        <w:t>. Click four distinct loop vertices. These vertices define the four logical corners. The portions of the loop between consecutive corners become the four block sides.</w:t>
-      </w:r>
-    </w:p>
-    <w:p>
-      <w:r>
-        <w:t>A block side may contain one or several CAD edges.</w:t>
-      </w:r>
-    </w:p>
-    <w:p>
-      <w:pPr>
-        <w:pStyle w:val="Heading2"/>
-      </w:pPr>
-      <w:r>
-        <w:t>5. Configure Edge Distributions</w:t>
-      </w:r>
-    </w:p>
-    <w:p>
-      <w:r>
-        <w:t xml:space="preserve">In the </w:t>
-      </w:r>
-      <w:r>
-        <w:rPr>
-          <w:b/>
-        </w:rPr>
-        <w:t>Distributions</w:t>
-      </w:r>
-      <w:r>
-        <w:t xml:space="preserve"> panel:</w:t>
-      </w:r>
-    </w:p>
-    <w:p>
-      <w:pPr>
-        <w:spacing w:after="60"/>
-        <w:ind w:left="346" w:hanging="346"/>
-      </w:pPr>
-      <w:r>
-        <w:t xml:space="preserve">1. </w:t>
-      </w:r>
-      <w:r>
-        <w:t xml:space="preserve">click </w:t>
-      </w:r>
-      <w:r>
-        <w:rPr>
-          <w:b/>
-        </w:rPr>
-        <w:t>Refresh Edges</w:t>
-      </w:r>
-      <w:r>
-        <w:t xml:space="preserve"> if necessary;</w:t>
-      </w:r>
-    </w:p>
-    <w:p>
-      <w:pPr>
-        <w:spacing w:after="60"/>
-        <w:ind w:left="346" w:hanging="346"/>
-      </w:pPr>
-      <w:r>
-        <w:t xml:space="preserve">2. </w:t>
-      </w:r>
-      <w:r>
-        <w:t>select one or more edges;</w:t>
-      </w:r>
-    </w:p>
-    <w:p>
-      <w:pPr>
-        <w:spacing w:after="60"/>
-        <w:ind w:left="346" w:hanging="346"/>
-      </w:pPr>
-      <w:r>
-        <w:t xml:space="preserve">3. </w:t>
-      </w:r>
-      <w:r>
-        <w:t>set the total number of nodes, including both endpoints;</w:t>
-      </w:r>
-    </w:p>
-    <w:p>
-      <w:pPr>
-        <w:spacing w:after="60"/>
-        <w:ind w:left="346" w:hanging="346"/>
-      </w:pPr>
-      <w:r>
-        <w:t xml:space="preserve">4. </w:t>
-      </w:r>
-      <w:r>
-        <w:t xml:space="preserve">choose </w:t>
-      </w:r>
-      <w:r>
-        <w:rPr>
-          <w:b/>
-        </w:rPr>
-        <w:t>Uniform</w:t>
-      </w:r>
-      <w:r>
-        <w:t xml:space="preserve"> or </w:t>
-      </w:r>
-      <w:r>
-        <w:rPr>
-          <w:b/>
-        </w:rPr>
-        <w:t>Biased</w:t>
-      </w:r>
-      <w:r>
-        <w:t xml:space="preserve"> distribution;</w:t>
-      </w:r>
-    </w:p>
-    <w:p>
-      <w:pPr>
-        <w:spacing w:after="60"/>
-        <w:ind w:left="346" w:hanging="346"/>
-      </w:pPr>
-      <w:r>
-        <w:t xml:space="preserve">5. </w:t>
-      </w:r>
-      <w:r>
-        <w:t xml:space="preserve">set </w:t>
-      </w:r>
-      <w:r>
-        <w:rPr>
-          <w:b/>
-        </w:rPr>
-        <w:t>Bias</w:t>
-      </w:r>
-      <w:r>
-        <w:t xml:space="preserve"> when a biased distribution is selected;</w:t>
-      </w:r>
-    </w:p>
-    <w:p>
-      <w:pPr>
-        <w:spacing w:after="60"/>
-        <w:ind w:left="346" w:hanging="346"/>
-      </w:pPr>
-      <w:r>
-        <w:t xml:space="preserve">6. </w:t>
-      </w:r>
-      <w:r>
-        <w:t xml:space="preserve">click </w:t>
-      </w:r>
-      <w:r>
-        <w:rPr>
-          <w:b/>
-        </w:rPr>
-        <w:t>Apply to Selected</w:t>
-      </w:r>
-      <w:r>
-        <w:t>.</w:t>
-      </w:r>
-    </w:p>
-    <w:p>
-      <w:r>
-        <w:t xml:space="preserve">You can also select an edge by clicking it on the canvas. Hold </w:t>
-      </w:r>
-      <w:r>
-        <w:rPr>
-          <w:b/>
-        </w:rPr>
-        <w:t>Ctrl</w:t>
-      </w:r>
-      <w:r>
-        <w:t xml:space="preserve"> while clicking to add or remove individual edges from the selection. A regular click selects only that edge, and clicking empty canvas clears the selection.</w:t>
-      </w:r>
-    </w:p>
-    <w:p>
-      <w:r>
-        <w:t>A shared edge has one distribution specification, so adjacent blocks automatically use the same interface nodes.</w:t>
-      </w:r>
-    </w:p>
-    <w:p>
-      <w:pPr>
-        <w:pStyle w:val="Heading3"/>
-      </w:pPr>
-      <w:r>
-        <w:t>Distribution Types</w:t>
-      </w:r>
-    </w:p>
-    <w:p>
-      <w:pPr>
-        <w:spacing w:after="60"/>
-        <w:ind w:left="346" w:hanging="346"/>
-      </w:pPr>
-      <w:r>
-        <w:t xml:space="preserve">• </w:t>
-      </w:r>
-      <w:r>
-        <w:rPr>
-          <w:b/>
-        </w:rPr>
-        <w:t>Uniform:</w:t>
-      </w:r>
-      <w:r>
-        <w:t xml:space="preserve"> equal spacing in the edge parameter.</w:t>
-      </w:r>
-    </w:p>
-    <w:p>
-      <w:pPr>
-        <w:spacing w:after="60"/>
-        <w:ind w:left="346" w:hanging="346"/>
-      </w:pPr>
-      <w:r>
-        <w:t xml:space="preserve">• </w:t>
-      </w:r>
-      <w:r>
-        <w:rPr>
-          <w:b/>
-        </w:rPr>
-        <w:t>Biased, Bias = 1:</w:t>
-      </w:r>
-      <w:r>
-        <w:t xml:space="preserve"> equivalent to uniform spacing.</w:t>
-      </w:r>
-    </w:p>
-    <w:p>
-      <w:pPr>
-        <w:spacing w:after="60"/>
-        <w:ind w:left="346" w:hanging="346"/>
-      </w:pPr>
-      <w:r>
-        <w:t xml:space="preserve">• </w:t>
-      </w:r>
-      <w:r>
-        <w:rPr>
-          <w:b/>
-        </w:rPr>
-        <w:t>Biased, Bias &gt; 1:</w:t>
-      </w:r>
-      <w:r>
-        <w:t xml:space="preserve"> smaller intervals near the edge start and progressively larger intervals toward the end.</w:t>
-      </w:r>
-    </w:p>
-    <w:p>
-      <w:pPr>
-        <w:pStyle w:val="Heading2"/>
-      </w:pPr>
-      <w:r>
-        <w:t>6. Validate Blocks</w:t>
-      </w:r>
-    </w:p>
-    <w:p>
-      <w:r>
-        <w:t xml:space="preserve">The </w:t>
-      </w:r>
-      <w:r>
-        <w:rPr>
-          <w:b/>
-        </w:rPr>
-        <w:t>Blocks</w:t>
-      </w:r>
-      <w:r>
-        <w:t xml:space="preserve"> panel reports whether opposite sides have compatible node totals.</w:t>
-      </w:r>
-    </w:p>
-    <w:p>
-      <w:r>
-        <w:t>Typical states are:</w:t>
-      </w:r>
-    </w:p>
-    <w:p>
-      <w:pPr>
-        <w:spacing w:after="60"/>
-        <w:ind w:left="346" w:hanging="346"/>
-      </w:pPr>
-      <w:r>
-        <w:t xml:space="preserve">• </w:t>
+      <w:r>
+        <w:t xml:space="preserve">The optional header is </w:t>
       </w:r>
       <w:r>
         <w:rPr>
@@ -1357,301 +959,35 @@
           <w:color w:val="80371E"/>
           <w:sz w:val="17"/>
         </w:rPr>
-        <w:t>OK (nodes N x M)</w:t>
+        <w:t>X,Y</w:t>
+      </w:r>
+      <w:r>
+        <w:t xml:space="preserve"> (case-insensitive). Blank rows are ignored, but each data row must contain exactly two finite numbers. The points are used in file order; they are never sorted. At least two points are required, and consecutive duplicates are rejected.</w:t>
       </w:r>
     </w:p>
     <w:p>
-      <w:pPr>
-        <w:spacing w:after="60"/>
-        <w:ind w:left="346" w:hanging="346"/>
-      </w:pPr>
-      <w:r>
-        <w:t xml:space="preserve">• </w:t>
-      </w:r>
-      <w:r>
-        <w:rPr>
-          <w:rFonts w:ascii="Cascadia Mono" w:hAnsi="Cascadia Mono"/>
-          <w:color w:val="80371E"/>
-          <w:sz w:val="17"/>
-        </w:rPr>
-        <w:t>MISMATCH sides 0/2: A vs B</w:t>
-      </w:r>
-    </w:p>
-    <w:p>
-      <w:pPr>
-        <w:spacing w:after="60"/>
-        <w:ind w:left="346" w:hanging="346"/>
-      </w:pPr>
-      <w:r>
-        <w:t xml:space="preserve">• </w:t>
-      </w:r>
-      <w:r>
-        <w:rPr>
-          <w:rFonts w:ascii="Cascadia Mono" w:hAnsi="Cascadia Mono"/>
-          <w:color w:val="80371E"/>
-          <w:sz w:val="17"/>
-        </w:rPr>
-        <w:t>MISMATCH sides 1/3: A vs B</w:t>
-      </w:r>
-    </w:p>
-    <w:p>
-      <w:r>
-        <w:t>For a valid structured block:</w:t>
-      </w:r>
-    </w:p>
-    <w:p>
-      <w:pPr>
-        <w:spacing w:after="60"/>
-        <w:ind w:left="346" w:hanging="346"/>
-      </w:pPr>
-      <w:r>
-        <w:t xml:space="preserve">• </w:t>
-      </w:r>
-      <w:r>
-        <w:t>side 0 must have the same total number of nodes as side 2;</w:t>
-      </w:r>
-    </w:p>
-    <w:p>
-      <w:pPr>
-        <w:spacing w:after="60"/>
-        <w:ind w:left="346" w:hanging="346"/>
-      </w:pPr>
-      <w:r>
-        <w:t xml:space="preserve">• </w:t>
-      </w:r>
-      <w:r>
-        <w:t>side 1 must have the same total number of nodes as side 3.</w:t>
-      </w:r>
-    </w:p>
-    <w:p>
-      <w:pPr>
-        <w:pStyle w:val="Heading2"/>
-      </w:pPr>
-      <w:r>
-        <w:t>7. Generate the Mesh</w:t>
-      </w:r>
-    </w:p>
-    <w:p>
-      <w:r>
-        <w:t xml:space="preserve">Click </w:t>
+      <w:r>
+        <w:t xml:space="preserve">MeshCAD previews the interpolated curve, marks its start in green and end in red, and reports the number of input points. Confirm with </w:t>
       </w:r>
       <w:r>
         <w:rPr>
           <w:b/>
         </w:rPr>
-        <w:t>Generate Mesh</w:t>
-      </w:r>
-      <w:r>
-        <w:t>. The structured grid appears over each valid block, and the status bar reports the number of blocks and cells.</w:t>
+        <w:t>Import</w:t>
+      </w:r>
+      <w:r>
+        <w:t xml:space="preserve"> to add the sequence as one spline edge. The first and last points are its topological endpoints; intermediate points are editable spline grips. If an endpoint lies within the topology tolerance of an existing vertex, it is connected to that vertex. No closure, smoothing, or point reduction is applied automatically. The imported curve can participate in a block loop when its endpoints connect to other geometry.</w:t>
       </w:r>
     </w:p>
     <w:p>
-      <w:r>
-        <w:t xml:space="preserve">Click </w:t>
-      </w:r>
-      <w:r>
-        <w:rPr>
-          <w:b/>
-        </w:rPr>
-        <w:t>Clear Mesh</w:t>
-      </w:r>
-      <w:r>
-        <w:t xml:space="preserve"> to hide generated meshes without deleting geometry, blocks, or distribution settings.</w:t>
-      </w:r>
-    </w:p>
-    <w:p>
-      <w:pPr>
-        <w:pStyle w:val="Heading1"/>
-      </w:pPr>
-      <w:r>
-        <w:t>Mesh Improvement Controls</w:t>
-      </w:r>
-    </w:p>
-    <w:p>
-      <w:r>
-        <w:t>The toolbar includes live controls for mesh improvement.</w:t>
-      </w:r>
-    </w:p>
-    <w:p>
-      <w:pPr>
-        <w:pStyle w:val="Heading2"/>
-      </w:pPr>
-      <w:r>
-        <w:t>Orthogonality</w:t>
-      </w:r>
-    </w:p>
-    <w:p>
-      <w:r>
-        <w:t xml:space="preserve">Enable </w:t>
-      </w:r>
-      <w:r>
-        <w:rPr>
-          <w:b/>
-        </w:rPr>
-        <w:t>Orthogonal</w:t>
-      </w:r>
-      <w:r>
-        <w:t xml:space="preserve"> to push the first interior layers toward the local boundary-normal direction.</w:t>
-      </w:r>
-    </w:p>
-    <w:p>
-      <w:pPr>
-        <w:spacing w:after="60"/>
-        <w:ind w:left="346" w:hanging="346"/>
-      </w:pPr>
-      <w:r>
-        <w:t xml:space="preserve">• </w:t>
-      </w:r>
-      <w:r>
-        <w:rPr>
-          <w:b/>
-        </w:rPr>
-        <w:t>Layers:</w:t>
-      </w:r>
-      <w:r>
-        <w:t xml:space="preserve"> number of interior layers affected.</w:t>
-      </w:r>
-    </w:p>
-    <w:p>
-      <w:pPr>
-        <w:spacing w:after="60"/>
-        <w:ind w:left="346" w:hanging="346"/>
-      </w:pPr>
-      <w:r>
-        <w:t xml:space="preserve">• </w:t>
-      </w:r>
-      <w:r>
-        <w:rPr>
-          <w:b/>
-        </w:rPr>
-        <w:t>Strength:</w:t>
-      </w:r>
-      <w:r>
-        <w:t xml:space="preserve"> correction fraction from </w:t>
-      </w:r>
-      <w:r>
-        <w:rPr>
-          <w:rFonts w:ascii="Cascadia Mono" w:hAnsi="Cascadia Mono"/>
-          <w:color w:val="80371E"/>
-          <w:sz w:val="17"/>
-        </w:rPr>
-        <w:t>0</w:t>
-      </w:r>
-      <w:r>
-        <w:t xml:space="preserve"> to </w:t>
-      </w:r>
-      <w:r>
-        <w:rPr>
-          <w:rFonts w:ascii="Cascadia Mono" w:hAnsi="Cascadia Mono"/>
-          <w:color w:val="80371E"/>
-          <w:sz w:val="17"/>
-        </w:rPr>
-        <w:t>1</w:t>
-      </w:r>
-      <w:r>
-        <w:t>.</w:t>
-      </w:r>
-    </w:p>
-    <w:p>
-      <w:r>
-        <w:t>Useful initial values are 2 to 4 layers and a strength from 0.70 to 0.90.</w:t>
-      </w:r>
-    </w:p>
-    <w:p>
-      <w:pPr>
-        <w:pStyle w:val="Heading2"/>
-      </w:pPr>
-      <w:r>
-        <w:t>Elliptic Smoothing</w:t>
-      </w:r>
-    </w:p>
-    <w:p>
-      <w:pPr>
-        <w:spacing w:after="60"/>
-        <w:ind w:left="346" w:hanging="346"/>
-      </w:pPr>
-      <w:r>
-        <w:t xml:space="preserve">• </w:t>
-      </w:r>
-      <w:r>
-        <w:rPr>
-          <w:b/>
-        </w:rPr>
-        <w:t>Smoothing:</w:t>
-      </w:r>
-      <w:r>
-        <w:t xml:space="preserve"> number of interior smoothing iterations.</w:t>
-      </w:r>
-    </w:p>
-    <w:p>
-      <w:pPr>
-        <w:spacing w:after="60"/>
-        <w:ind w:left="346" w:hanging="346"/>
-      </w:pPr>
-      <w:r>
-        <w:t xml:space="preserve">• </w:t>
-      </w:r>
-      <w:r>
-        <w:rPr>
-          <w:b/>
-        </w:rPr>
-        <w:t>Relaxation:</w:t>
-      </w:r>
-      <w:r>
-        <w:t xml:space="preserve"> update fraction per iteration.</w:t>
-      </w:r>
-    </w:p>
-    <w:p>
-      <w:r>
-        <w:t>Useful initial values are 20 to 60 iterations and a relaxation factor from 0.30 to 0.50. Boundary nodes remain fixed.</w:t>
-      </w:r>
-    </w:p>
-    <w:p>
-      <w:pPr>
-        <w:pStyle w:val="Heading1"/>
-      </w:pPr>
-      <w:r>
-        <w:t>Complete Tutorials</w:t>
-      </w:r>
-    </w:p>
-    <w:p>
-      <w:r>
-        <w:t>The tutorials below start from a blank project and use the controls in the current application. Drawing clicks are approximate; use the status-bar coordinates and grid as a guide. The important requirements are shared snapped vertices, closed loops, and matching node counts on opposite sides.</w:t>
-      </w:r>
-    </w:p>
-    <w:p>
-      <w:r>
-        <w:br w:type="page"/>
-      </w:r>
-    </w:p>
-    <w:p>
-      <w:pPr>
-        <w:pStyle w:val="Heading2"/>
-      </w:pPr>
-      <w:r>
-        <w:t>Tutorial 1: Rectangular Block from Drawing to Mesh</w:t>
-      </w:r>
-    </w:p>
-    <w:p>
-      <w:r>
-        <w:rPr>
-          <w:b/>
-        </w:rPr>
-        <w:t>Goal:</w:t>
-      </w:r>
-      <w:r>
-        <w:t xml:space="preserve"> Build one rectangular block with 9 nodes horizontally and 6 vertically (40 cells).</w:t>
-      </w:r>
-    </w:p>
-    <w:p>
-      <w:pPr>
-        <w:spacing w:before="40" w:after="20"/>
+      <w:pPr>
+        <w:spacing w:after="20"/>
         <w:jc w:val="center"/>
       </w:pPr>
       <w:r>
         <w:drawing>
           <wp:inline xmlns:a="http://schemas.openxmlformats.org/drawingml/2006/main" xmlns:pic="http://schemas.openxmlformats.org/drawingml/2006/picture">
-            <wp:extent cx="6035040" cy="3195021"/>
+            <wp:extent cx="6035040" cy="4358640"/>
             <wp:docPr id="1" name="Picture 1"/>
             <wp:cNvGraphicFramePr>
               <a:graphicFrameLocks noChangeAspect="1"/>
@@ -1660,7 +996,7 @@
               <a:graphicData uri="http://schemas.openxmlformats.org/drawingml/2006/picture">
                 <pic:pic>
                   <pic:nvPicPr>
-                    <pic:cNvPr id="0" name="tutorial-1-rectangular-block.png"/>
+                    <pic:cNvPr id="0" name="point-sequence-preview.png"/>
                     <pic:cNvPicPr/>
                   </pic:nvPicPr>
                   <pic:blipFill>
@@ -1672,7 +1008,7 @@
                   <pic:spPr>
                     <a:xfrm>
                       <a:off x="0" y="0"/>
-                      <a:ext cx="6035040" cy="3195021"/>
+                      <a:ext cx="6035040" cy="4358640"/>
                     </a:xfrm>
                     <a:prstGeom prst="rect"/>
                   </pic:spPr>
@@ -1694,91 +1030,20 @@
           <w:color w:val="5A6473"/>
           <w:sz w:val="16"/>
         </w:rPr>
-        <w:t>MeshCAD showing a generated rectangular block with a 9 by 6 node grid and a valid block status.</w:t>
+        <w:t>MeshCAD point-sequence import preview with the curve start marked in green and its end in red.</w:t>
       </w:r>
     </w:p>
     <w:p>
       <w:pPr>
-        <w:spacing w:after="60"/>
-        <w:ind w:left="346" w:hanging="346"/>
-      </w:pPr>
-      <w:r>
-        <w:t xml:space="preserve">1. </w:t>
-      </w:r>
-      <w:r>
-        <w:t xml:space="preserve">Start MeshCAD and choose </w:t>
-      </w:r>
-      <w:r>
-        <w:rPr>
-          <w:b/>
-        </w:rPr>
-        <w:t>File &gt; New</w:t>
-      </w:r>
-      <w:r>
-        <w:t xml:space="preserve"> if a project is already open.</w:t>
+        <w:pStyle w:val="Heading2"/>
+      </w:pPr>
+      <w:r>
+        <w:t>2. Edit Geometry</w:t>
       </w:r>
     </w:p>
     <w:p>
-      <w:pPr>
-        <w:spacing w:after="60"/>
-        <w:ind w:left="346" w:hanging="346"/>
-      </w:pPr>
-      <w:r>
-        <w:t xml:space="preserve">2. </w:t>
-      </w:r>
-      <w:r>
-        <w:t xml:space="preserve">Leave </w:t>
-      </w:r>
-      <w:r>
-        <w:rPr>
-          <w:b/>
-        </w:rPr>
-        <w:t>Show Grid</w:t>
-      </w:r>
-      <w:r>
-        <w:t xml:space="preserve"> enabled. Adjust </w:t>
-      </w:r>
-      <w:r>
-        <w:rPr>
-          <w:b/>
-        </w:rPr>
-        <w:t>Spacing</w:t>
-      </w:r>
-      <w:r>
-        <w:t xml:space="preserve"> if a finer or coarser drawing reference is useful.</w:t>
-      </w:r>
-    </w:p>
-    <w:p>
-      <w:pPr>
-        <w:spacing w:after="60"/>
-        <w:ind w:left="346" w:hanging="346"/>
-      </w:pPr>
-      <w:r>
-        <w:t xml:space="preserve">3. </w:t>
-      </w:r>
-      <w:r>
-        <w:t xml:space="preserve">Click </w:t>
-      </w:r>
-      <w:r>
-        <w:rPr>
-          <w:b/>
-        </w:rPr>
-        <w:t>Line</w:t>
-      </w:r>
-      <w:r>
-        <w:t>. Draw the four rectangle sides by clicking the lower-left, lower-right, upper-right, upper-left, and lower-left points in sequence. Snap the last click to the first vertex so the contour closes. The Line button remains highlighted while drawing.</w:t>
-      </w:r>
-    </w:p>
-    <w:p>
-      <w:pPr>
-        <w:spacing w:after="60"/>
-        <w:ind w:left="346" w:hanging="346"/>
-      </w:pPr>
-      <w:r>
-        <w:t xml:space="preserve">4. </w:t>
-      </w:r>
-      <w:r>
-        <w:t xml:space="preserve">Click </w:t>
+      <w:r>
+        <w:t xml:space="preserve">Switch to </w:t>
       </w:r>
       <w:r>
         <w:rPr>
@@ -1787,7 +1052,80 @@
         <w:t>Select</w:t>
       </w:r>
       <w:r>
-        <w:t xml:space="preserve"> to leave line-drawing mode. In the </w:t>
+        <w:t xml:space="preserve"> before editing.</w:t>
+      </w:r>
+    </w:p>
+    <w:p>
+      <w:pPr>
+        <w:spacing w:after="60"/>
+        <w:ind w:left="346" w:hanging="346"/>
+      </w:pPr>
+      <w:r>
+        <w:t xml:space="preserve">• </w:t>
+      </w:r>
+      <w:r>
+        <w:t>Drag a red vertex to move every connected edge.</w:t>
+      </w:r>
+    </w:p>
+    <w:p>
+      <w:pPr>
+        <w:spacing w:after="60"/>
+        <w:ind w:left="346" w:hanging="346"/>
+      </w:pPr>
+      <w:r>
+        <w:t xml:space="preserve">• </w:t>
+      </w:r>
+      <w:r>
+        <w:t>Drag a blue grip to move an arc center or an internal spline control point.</w:t>
+      </w:r>
+    </w:p>
+    <w:p>
+      <w:pPr>
+        <w:spacing w:after="60"/>
+        <w:ind w:left="346" w:hanging="346"/>
+      </w:pPr>
+      <w:r>
+        <w:t xml:space="preserve">• </w:t>
+      </w:r>
+      <w:r>
+        <w:t>Double-click a vertex or grip to enter exact coordinates.</w:t>
+      </w:r>
+    </w:p>
+    <w:p>
+      <w:pPr>
+        <w:spacing w:after="60"/>
+        <w:ind w:left="346" w:hanging="346"/>
+      </w:pPr>
+      <w:r>
+        <w:t xml:space="preserve">• </w:t>
+      </w:r>
+      <w:r>
+        <w:t>When an arc center is edited, its endpoints remain fixed and the center is constrained to the chord perpendicular bisector.</w:t>
+      </w:r>
+    </w:p>
+    <w:p>
+      <w:pPr>
+        <w:spacing w:after="60"/>
+        <w:ind w:left="346" w:hanging="346"/>
+      </w:pPr>
+      <w:r>
+        <w:t xml:space="preserve">• </w:t>
+      </w:r>
+      <w:r>
+        <w:t>Existing block meshes are regenerated automatically after relevant geometry changes.</w:t>
+      </w:r>
+    </w:p>
+    <w:p>
+      <w:pPr>
+        <w:pStyle w:val="Heading2"/>
+      </w:pPr>
+      <w:r>
+        <w:t>3. Detect a Closed Loop</w:t>
+      </w:r>
+    </w:p>
+    <w:p>
+      <w:r>
+        <w:t xml:space="preserve">In the </w:t>
       </w:r>
       <w:r>
         <w:rPr>
@@ -1805,19 +1143,82 @@
         <w:t>Detect Loops</w:t>
       </w:r>
       <w:r>
-        <w:t>. Select the detected four-edge loop; it is highlighted green on the canvas.</w:t>
+        <w:t>. Closed contours are listed. Selecting a loop highlights it in green on the canvas.</w:t>
       </w:r>
     </w:p>
     <w:p>
+      <w:r>
+        <w:t>If no loop is detected:</w:t>
+      </w:r>
+    </w:p>
+    <w:p>
       <w:pPr>
         <w:spacing w:after="60"/>
         <w:ind w:left="346" w:hanging="346"/>
       </w:pPr>
       <w:r>
-        <w:t xml:space="preserve">5. </w:t>
-      </w:r>
-      <w:r>
-        <w:t xml:space="preserve">Click </w:t>
+        <w:t xml:space="preserve">1. </w:t>
+      </w:r>
+      <w:r>
+        <w:t>zoom into every connection;</w:t>
+      </w:r>
+    </w:p>
+    <w:p>
+      <w:pPr>
+        <w:spacing w:after="60"/>
+        <w:ind w:left="346" w:hanging="346"/>
+      </w:pPr>
+      <w:r>
+        <w:t xml:space="preserve">2. </w:t>
+      </w:r>
+      <w:r>
+        <w:t>check for gaps or duplicate endpoints;</w:t>
+      </w:r>
+    </w:p>
+    <w:p>
+      <w:pPr>
+        <w:spacing w:after="60"/>
+        <w:ind w:left="346" w:hanging="346"/>
+      </w:pPr>
+      <w:r>
+        <w:t xml:space="preserve">3. </w:t>
+      </w:r>
+      <w:r>
+        <w:t>use snapping or double-click coordinate editing to make endpoints coincide;</w:t>
+      </w:r>
+    </w:p>
+    <w:p>
+      <w:pPr>
+        <w:spacing w:after="60"/>
+        <w:ind w:left="346" w:hanging="346"/>
+      </w:pPr>
+      <w:r>
+        <w:t xml:space="preserve">4. </w:t>
+      </w:r>
+      <w:r>
+        <w:t xml:space="preserve">run </w:t>
+      </w:r>
+      <w:r>
+        <w:rPr>
+          <w:b/>
+        </w:rPr>
+        <w:t>Detect Loops</w:t>
+      </w:r>
+      <w:r>
+        <w:t xml:space="preserve"> again.</w:t>
+      </w:r>
+    </w:p>
+    <w:p>
+      <w:pPr>
+        <w:pStyle w:val="Heading2"/>
+      </w:pPr>
+      <w:r>
+        <w:t>4. Create a Structured Block</w:t>
+      </w:r>
+    </w:p>
+    <w:p>
+      <w:r>
+        <w:t xml:space="preserve">Select a loop and click </w:t>
       </w:r>
       <w:r>
         <w:rPr>
@@ -1826,7 +1227,245 @@
         <w:t>Create Block from Loop</w:t>
       </w:r>
       <w:r>
-        <w:t xml:space="preserve">, then click the four rectangle vertices. They can be selected in any order, but all four must be distinct. The </w:t>
+        <w:t>. Click four distinct loop vertices. These vertices define the four logical corners. The portions of the loop between consecutive corners become the four block sides.</w:t>
+      </w:r>
+    </w:p>
+    <w:p>
+      <w:r>
+        <w:t>A block side may contain one or several CAD edges.</w:t>
+      </w:r>
+    </w:p>
+    <w:p>
+      <w:pPr>
+        <w:pStyle w:val="Heading2"/>
+      </w:pPr>
+      <w:r>
+        <w:t>5. Configure Edge Distributions</w:t>
+      </w:r>
+    </w:p>
+    <w:p>
+      <w:r>
+        <w:t xml:space="preserve">In the </w:t>
+      </w:r>
+      <w:r>
+        <w:rPr>
+          <w:b/>
+        </w:rPr>
+        <w:t>Distributions</w:t>
+      </w:r>
+      <w:r>
+        <w:t xml:space="preserve"> panel:</w:t>
+      </w:r>
+    </w:p>
+    <w:p>
+      <w:pPr>
+        <w:spacing w:after="60"/>
+        <w:ind w:left="346" w:hanging="346"/>
+      </w:pPr>
+      <w:r>
+        <w:t xml:space="preserve">1. </w:t>
+      </w:r>
+      <w:r>
+        <w:t xml:space="preserve">click </w:t>
+      </w:r>
+      <w:r>
+        <w:rPr>
+          <w:b/>
+        </w:rPr>
+        <w:t>Refresh Edges</w:t>
+      </w:r>
+      <w:r>
+        <w:t xml:space="preserve"> if necessary;</w:t>
+      </w:r>
+    </w:p>
+    <w:p>
+      <w:pPr>
+        <w:spacing w:after="60"/>
+        <w:ind w:left="346" w:hanging="346"/>
+      </w:pPr>
+      <w:r>
+        <w:t xml:space="preserve">2. </w:t>
+      </w:r>
+      <w:r>
+        <w:t>select one or more edges;</w:t>
+      </w:r>
+    </w:p>
+    <w:p>
+      <w:pPr>
+        <w:spacing w:after="60"/>
+        <w:ind w:left="346" w:hanging="346"/>
+      </w:pPr>
+      <w:r>
+        <w:t xml:space="preserve">3. </w:t>
+      </w:r>
+      <w:r>
+        <w:t>set the total number of nodes, including both endpoints;</w:t>
+      </w:r>
+    </w:p>
+    <w:p>
+      <w:pPr>
+        <w:spacing w:after="60"/>
+        <w:ind w:left="346" w:hanging="346"/>
+      </w:pPr>
+      <w:r>
+        <w:t xml:space="preserve">4. </w:t>
+      </w:r>
+      <w:r>
+        <w:t xml:space="preserve">choose </w:t>
+      </w:r>
+      <w:r>
+        <w:rPr>
+          <w:b/>
+        </w:rPr>
+        <w:t>Uniform</w:t>
+      </w:r>
+      <w:r>
+        <w:t xml:space="preserve"> or </w:t>
+      </w:r>
+      <w:r>
+        <w:rPr>
+          <w:b/>
+        </w:rPr>
+        <w:t>Biased</w:t>
+      </w:r>
+      <w:r>
+        <w:t xml:space="preserve"> distribution;</w:t>
+      </w:r>
+    </w:p>
+    <w:p>
+      <w:pPr>
+        <w:spacing w:after="60"/>
+        <w:ind w:left="346" w:hanging="346"/>
+      </w:pPr>
+      <w:r>
+        <w:t xml:space="preserve">5. </w:t>
+      </w:r>
+      <w:r>
+        <w:t xml:space="preserve">set </w:t>
+      </w:r>
+      <w:r>
+        <w:rPr>
+          <w:b/>
+        </w:rPr>
+        <w:t>Bias</w:t>
+      </w:r>
+      <w:r>
+        <w:t xml:space="preserve"> when a biased distribution is selected;</w:t>
+      </w:r>
+    </w:p>
+    <w:p>
+      <w:pPr>
+        <w:spacing w:after="60"/>
+        <w:ind w:left="346" w:hanging="346"/>
+      </w:pPr>
+      <w:r>
+        <w:t xml:space="preserve">6. </w:t>
+      </w:r>
+      <w:r>
+        <w:t xml:space="preserve">click </w:t>
+      </w:r>
+      <w:r>
+        <w:rPr>
+          <w:b/>
+        </w:rPr>
+        <w:t>Apply to Selected</w:t>
+      </w:r>
+      <w:r>
+        <w:t>.</w:t>
+      </w:r>
+    </w:p>
+    <w:p>
+      <w:r>
+        <w:t xml:space="preserve">You can also select an edge by clicking it on the canvas. Hold </w:t>
+      </w:r>
+      <w:r>
+        <w:rPr>
+          <w:b/>
+        </w:rPr>
+        <w:t>Ctrl</w:t>
+      </w:r>
+      <w:r>
+        <w:t xml:space="preserve"> while clicking to add or remove individual edges from the selection. A regular click selects only that edge, and clicking empty canvas clears the selection.</w:t>
+      </w:r>
+    </w:p>
+    <w:p>
+      <w:r>
+        <w:t>A shared edge has one distribution specification, so adjacent blocks automatically use the same interface nodes.</w:t>
+      </w:r>
+    </w:p>
+    <w:p>
+      <w:pPr>
+        <w:pStyle w:val="Heading3"/>
+      </w:pPr>
+      <w:r>
+        <w:t>Distribution Types</w:t>
+      </w:r>
+    </w:p>
+    <w:p>
+      <w:pPr>
+        <w:spacing w:after="60"/>
+        <w:ind w:left="346" w:hanging="346"/>
+      </w:pPr>
+      <w:r>
+        <w:t xml:space="preserve">• </w:t>
+      </w:r>
+      <w:r>
+        <w:rPr>
+          <w:b/>
+        </w:rPr>
+        <w:t>Uniform:</w:t>
+      </w:r>
+      <w:r>
+        <w:t xml:space="preserve"> equal spacing in the edge parameter.</w:t>
+      </w:r>
+    </w:p>
+    <w:p>
+      <w:pPr>
+        <w:spacing w:after="60"/>
+        <w:ind w:left="346" w:hanging="346"/>
+      </w:pPr>
+      <w:r>
+        <w:t xml:space="preserve">• </w:t>
+      </w:r>
+      <w:r>
+        <w:rPr>
+          <w:b/>
+        </w:rPr>
+        <w:t>Biased, Bias = 1:</w:t>
+      </w:r>
+      <w:r>
+        <w:t xml:space="preserve"> equivalent to uniform spacing.</w:t>
+      </w:r>
+    </w:p>
+    <w:p>
+      <w:pPr>
+        <w:spacing w:after="60"/>
+        <w:ind w:left="346" w:hanging="346"/>
+      </w:pPr>
+      <w:r>
+        <w:t xml:space="preserve">• </w:t>
+      </w:r>
+      <w:r>
+        <w:rPr>
+          <w:b/>
+        </w:rPr>
+        <w:t>Biased, Bias &gt; 1:</w:t>
+      </w:r>
+      <w:r>
+        <w:t xml:space="preserve"> smaller intervals near the edge start and progressively larger intervals toward the end.</w:t>
+      </w:r>
+    </w:p>
+    <w:p>
+      <w:pPr>
+        <w:pStyle w:val="Heading2"/>
+      </w:pPr>
+      <w:r>
+        <w:t>6. Validate Blocks</w:t>
+      </w:r>
+    </w:p>
+    <w:p>
+      <w:r>
+        <w:t xml:space="preserve">The </w:t>
       </w:r>
       <w:r>
         <w:rPr>
@@ -1835,46 +1474,21 @@
         <w:t>Blocks</w:t>
       </w:r>
       <w:r>
-        <w:t xml:space="preserve"> panel should show one block.</w:t>
+        <w:t xml:space="preserve"> panel reports whether opposite sides have compatible node totals.</w:t>
       </w:r>
     </w:p>
     <w:p>
+      <w:r>
+        <w:t>Typical states are:</w:t>
+      </w:r>
+    </w:p>
+    <w:p>
       <w:pPr>
         <w:spacing w:after="60"/>
         <w:ind w:left="346" w:hanging="346"/>
       </w:pPr>
       <w:r>
-        <w:t xml:space="preserve">6. </w:t>
-      </w:r>
-      <w:r>
-        <w:t xml:space="preserve">In </w:t>
-      </w:r>
-      <w:r>
-        <w:rPr>
-          <w:b/>
-        </w:rPr>
-        <w:t>Distributions</w:t>
-      </w:r>
-      <w:r>
-        <w:t xml:space="preserve">, click </w:t>
-      </w:r>
-      <w:r>
-        <w:rPr>
-          <w:b/>
-        </w:rPr>
-        <w:t>Refresh Edges</w:t>
-      </w:r>
-      <w:r>
-        <w:t xml:space="preserve"> if needed. Select the lower and upper edges (use Ctrl-click for multiple edges). Set </w:t>
-      </w:r>
-      <w:r>
-        <w:rPr>
-          <w:b/>
-        </w:rPr>
-        <w:t>Nodes</w:t>
-      </w:r>
-      <w:r>
-        <w:t xml:space="preserve"> to </w:t>
+        <w:t xml:space="preserve">• </w:t>
       </w:r>
       <w:r>
         <w:rPr>
@@ -1882,37 +1496,7 @@
           <w:color w:val="80371E"/>
           <w:sz w:val="17"/>
         </w:rPr>
-        <w:t>9</w:t>
-      </w:r>
-      <w:r>
-        <w:t xml:space="preserve">, </w:t>
-      </w:r>
-      <w:r>
-        <w:rPr>
-          <w:b/>
-        </w:rPr>
-        <w:t>Distribution</w:t>
-      </w:r>
-      <w:r>
-        <w:t xml:space="preserve"> to </w:t>
-      </w:r>
-      <w:r>
-        <w:rPr>
-          <w:b/>
-        </w:rPr>
-        <w:t>Uniform</w:t>
-      </w:r>
-      <w:r>
-        <w:t xml:space="preserve">, then click </w:t>
-      </w:r>
-      <w:r>
-        <w:rPr>
-          <w:b/>
-        </w:rPr>
-        <w:t>Apply to Selected</w:t>
-      </w:r>
-      <w:r>
-        <w:t>.</w:t>
+        <w:t>OK (nodes N x M)</w:t>
       </w:r>
     </w:p>
     <w:p>
@@ -1921,19 +1505,7 @@
         <w:ind w:left="346" w:hanging="346"/>
       </w:pPr>
       <w:r>
-        <w:t xml:space="preserve">7. </w:t>
-      </w:r>
-      <w:r>
-        <w:t xml:space="preserve">Select the left and right edges. Set </w:t>
-      </w:r>
-      <w:r>
-        <w:rPr>
-          <w:b/>
-        </w:rPr>
-        <w:t>Nodes</w:t>
-      </w:r>
-      <w:r>
-        <w:t xml:space="preserve"> to </w:t>
+        <w:t xml:space="preserve">• </w:t>
       </w:r>
       <w:r>
         <w:rPr>
@@ -1941,28 +1513,7 @@
           <w:color w:val="80371E"/>
           <w:sz w:val="17"/>
         </w:rPr>
-        <w:t>6</w:t>
-      </w:r>
-      <w:r>
-        <w:t xml:space="preserve">, keep </w:t>
-      </w:r>
-      <w:r>
-        <w:rPr>
-          <w:b/>
-        </w:rPr>
-        <w:t>Uniform</w:t>
-      </w:r>
-      <w:r>
-        <w:t xml:space="preserve">, and click </w:t>
-      </w:r>
-      <w:r>
-        <w:rPr>
-          <w:b/>
-        </w:rPr>
-        <w:t>Apply to Selected</w:t>
-      </w:r>
-      <w:r>
-        <w:t>.</w:t>
+        <w:t>MISMATCH sides 0/2: A vs B</w:t>
       </w:r>
     </w:p>
     <w:p>
@@ -1971,10 +1522,7 @@
         <w:ind w:left="346" w:hanging="346"/>
       </w:pPr>
       <w:r>
-        <w:t xml:space="preserve">8. </w:t>
-      </w:r>
-      <w:r>
-        <w:t xml:space="preserve">Confirm the block status is </w:t>
+        <w:t xml:space="preserve">• </w:t>
       </w:r>
       <w:r>
         <w:rPr>
@@ -1982,20 +1530,47 @@
           <w:color w:val="80371E"/>
           <w:sz w:val="17"/>
         </w:rPr>
-        <w:t>OK (nodes 9 x 6)</w:t>
-      </w:r>
-      <w:r>
-        <w:t>. If it reports a mismatch, inspect the listed opposite sides and apply matching totals.</w:t>
+        <w:t>MISMATCH sides 1/3: A vs B</w:t>
       </w:r>
     </w:p>
     <w:p>
+      <w:r>
+        <w:t>For a valid structured block:</w:t>
+      </w:r>
+    </w:p>
+    <w:p>
       <w:pPr>
         <w:spacing w:after="60"/>
         <w:ind w:left="346" w:hanging="346"/>
       </w:pPr>
       <w:r>
-        <w:t xml:space="preserve">9. </w:t>
-      </w:r>
+        <w:t xml:space="preserve">• </w:t>
+      </w:r>
+      <w:r>
+        <w:t>side 0 must have the same total number of nodes as side 2;</w:t>
+      </w:r>
+    </w:p>
+    <w:p>
+      <w:pPr>
+        <w:spacing w:after="60"/>
+        <w:ind w:left="346" w:hanging="346"/>
+      </w:pPr>
+      <w:r>
+        <w:t xml:space="preserve">• </w:t>
+      </w:r>
+      <w:r>
+        <w:t>side 1 must have the same total number of nodes as side 3.</w:t>
+      </w:r>
+    </w:p>
+    <w:p>
+      <w:pPr>
+        <w:pStyle w:val="Heading2"/>
+      </w:pPr>
+      <w:r>
+        <w:t>7. Generate the Mesh</w:t>
+      </w:r>
+    </w:p>
+    <w:p>
       <w:r>
         <w:t xml:space="preserve">Click </w:t>
       </w:r>
@@ -2006,7 +1581,92 @@
         <w:t>Generate Mesh</w:t>
       </w:r>
       <w:r>
-        <w:t xml:space="preserve">. The canvas should show a structured grid with </w:t>
+        <w:t>. The structured grid appears over each valid block, and the status bar reports the number of blocks and cells.</w:t>
+      </w:r>
+    </w:p>
+    <w:p>
+      <w:r>
+        <w:t xml:space="preserve">Click </w:t>
+      </w:r>
+      <w:r>
+        <w:rPr>
+          <w:b/>
+        </w:rPr>
+        <w:t>Clear Mesh</w:t>
+      </w:r>
+      <w:r>
+        <w:t xml:space="preserve"> to hide generated meshes without deleting geometry, blocks, or distribution settings.</w:t>
+      </w:r>
+    </w:p>
+    <w:p>
+      <w:pPr>
+        <w:pStyle w:val="Heading1"/>
+      </w:pPr>
+      <w:r>
+        <w:t>Mesh Improvement Controls</w:t>
+      </w:r>
+    </w:p>
+    <w:p>
+      <w:r>
+        <w:t>The toolbar includes live controls for mesh improvement.</w:t>
+      </w:r>
+    </w:p>
+    <w:p>
+      <w:pPr>
+        <w:pStyle w:val="Heading2"/>
+      </w:pPr>
+      <w:r>
+        <w:t>Orthogonality</w:t>
+      </w:r>
+    </w:p>
+    <w:p>
+      <w:r>
+        <w:t xml:space="preserve">Enable </w:t>
+      </w:r>
+      <w:r>
+        <w:rPr>
+          <w:b/>
+        </w:rPr>
+        <w:t>Orthogonal</w:t>
+      </w:r>
+      <w:r>
+        <w:t xml:space="preserve"> to push the first interior layers toward the local boundary-normal direction.</w:t>
+      </w:r>
+    </w:p>
+    <w:p>
+      <w:pPr>
+        <w:spacing w:after="60"/>
+        <w:ind w:left="346" w:hanging="346"/>
+      </w:pPr>
+      <w:r>
+        <w:t xml:space="preserve">• </w:t>
+      </w:r>
+      <w:r>
+        <w:rPr>
+          <w:b/>
+        </w:rPr>
+        <w:t>Layers:</w:t>
+      </w:r>
+      <w:r>
+        <w:t xml:space="preserve"> number of interior layers affected.</w:t>
+      </w:r>
+    </w:p>
+    <w:p>
+      <w:pPr>
+        <w:spacing w:after="60"/>
+        <w:ind w:left="346" w:hanging="346"/>
+      </w:pPr>
+      <w:r>
+        <w:t xml:space="preserve">• </w:t>
+      </w:r>
+      <w:r>
+        <w:rPr>
+          <w:b/>
+        </w:rPr>
+        <w:t>Strength:</w:t>
+      </w:r>
+      <w:r>
+        <w:t xml:space="preserve"> correction fraction from </w:t>
       </w:r>
       <w:r>
         <w:rPr>
@@ -2014,31 +1674,10 @@
           <w:color w:val="80371E"/>
           <w:sz w:val="17"/>
         </w:rPr>
-        <w:t>(9 - 1) x (6 - 1) = 40</w:t>
-      </w:r>
-      <w:r>
-        <w:t xml:space="preserve"> cells.</w:t>
-      </w:r>
-    </w:p>
-    <w:p>
-      <w:pPr>
-        <w:spacing w:after="60"/>
-        <w:ind w:left="346" w:hanging="346"/>
-      </w:pPr>
-      <w:r>
-        <w:t xml:space="preserve">10. </w:t>
-      </w:r>
-      <w:r>
-        <w:t xml:space="preserve">Choose </w:t>
-      </w:r>
-      <w:r>
-        <w:rPr>
-          <w:b/>
-        </w:rPr>
-        <w:t>File &gt; Save As</w:t>
-      </w:r>
-      <w:r>
-        <w:t xml:space="preserve"> and save the project as a </w:t>
+        <w:t>0</w:t>
+      </w:r>
+      <w:r>
+        <w:t xml:space="preserve"> to </w:t>
       </w:r>
       <w:r>
         <w:rPr>
@@ -2046,15 +1685,15 @@
           <w:color w:val="80371E"/>
           <w:sz w:val="17"/>
         </w:rPr>
-        <w:t>.json</w:t>
-      </w:r>
-      <w:r>
-        <w:t xml:space="preserve"> file.</w:t>
+        <w:t>1</w:t>
+      </w:r>
+      <w:r>
+        <w:t>.</w:t>
       </w:r>
     </w:p>
     <w:p>
       <w:r>
-        <w:br w:type="page"/>
+        <w:t>Useful initial values are 2 to 4 layers and a strength from 0.70 to 0.90.</w:t>
       </w:r>
     </w:p>
     <w:p>
@@ -2062,7 +1701,74 @@
         <w:pStyle w:val="Heading2"/>
       </w:pPr>
       <w:r>
-        <w:t>Tutorial 2: Two Conformal Blocks and a Shared Interface</w:t>
+        <w:t>Elliptic Smoothing</w:t>
+      </w:r>
+    </w:p>
+    <w:p>
+      <w:pPr>
+        <w:spacing w:after="60"/>
+        <w:ind w:left="346" w:hanging="346"/>
+      </w:pPr>
+      <w:r>
+        <w:t xml:space="preserve">• </w:t>
+      </w:r>
+      <w:r>
+        <w:rPr>
+          <w:b/>
+        </w:rPr>
+        <w:t>Smoothing:</w:t>
+      </w:r>
+      <w:r>
+        <w:t xml:space="preserve"> number of interior smoothing iterations.</w:t>
+      </w:r>
+    </w:p>
+    <w:p>
+      <w:pPr>
+        <w:spacing w:after="60"/>
+        <w:ind w:left="346" w:hanging="346"/>
+      </w:pPr>
+      <w:r>
+        <w:t xml:space="preserve">• </w:t>
+      </w:r>
+      <w:r>
+        <w:rPr>
+          <w:b/>
+        </w:rPr>
+        <w:t>Relaxation:</w:t>
+      </w:r>
+      <w:r>
+        <w:t xml:space="preserve"> update fraction per iteration.</w:t>
+      </w:r>
+    </w:p>
+    <w:p>
+      <w:r>
+        <w:t>Useful initial values are 20 to 60 iterations and a relaxation factor from 0.30 to 0.50. Boundary nodes remain fixed.</w:t>
+      </w:r>
+    </w:p>
+    <w:p>
+      <w:pPr>
+        <w:pStyle w:val="Heading1"/>
+      </w:pPr>
+      <w:r>
+        <w:t>Complete Tutorials</w:t>
+      </w:r>
+    </w:p>
+    <w:p>
+      <w:r>
+        <w:t>The tutorials below start from a blank project and use the controls in the current application. Drawing clicks are approximate; use the status-bar coordinates and grid as a guide. The important requirements are shared snapped vertices, closed loops, and matching node counts on opposite sides.</w:t>
+      </w:r>
+    </w:p>
+    <w:p>
+      <w:r>
+        <w:br w:type="page"/>
+      </w:r>
+    </w:p>
+    <w:p>
+      <w:pPr>
+        <w:pStyle w:val="Heading2"/>
+      </w:pPr>
+      <w:r>
+        <w:t>Tutorial 1: Rectangular Block from Drawing to Mesh</w:t>
       </w:r>
     </w:p>
     <w:p>
@@ -2073,12 +1779,12 @@
         <w:t>Goal:</w:t>
       </w:r>
       <w:r>
-        <w:t xml:space="preserve"> Create two side-by-side rectangular blocks that share one edge and have matching interface nodes.</w:t>
+        <w:t xml:space="preserve"> Build one rectangular block with 9 nodes horizontally and 6 vertically (40 cells).</w:t>
       </w:r>
     </w:p>
     <w:p>
       <w:pPr>
-        <w:spacing w:before="40" w:after="20"/>
+        <w:spacing w:after="20"/>
         <w:jc w:val="center"/>
       </w:pPr>
       <w:r>
@@ -2093,7 +1799,7 @@
               <a:graphicData uri="http://schemas.openxmlformats.org/drawingml/2006/picture">
                 <pic:pic>
                   <pic:nvPicPr>
-                    <pic:cNvPr id="0" name="tutorial-2-shared-interface.png"/>
+                    <pic:cNvPr id="0" name="tutorial-1-rectangular-block.png"/>
                     <pic:cNvPicPr/>
                   </pic:nvPicPr>
                   <pic:blipFill>
@@ -2127,7 +1833,7 @@
           <w:color w:val="5A6473"/>
           <w:sz w:val="16"/>
         </w:rPr>
-        <w:t>MeshCAD showing two structured blocks joined at a conformal shared interface.</w:t>
+        <w:t>MeshCAD showing a generated rectangular block with a 9 by 6 node grid and a valid block status.</w:t>
       </w:r>
     </w:p>
     <w:p>
@@ -2139,7 +1845,58 @@
         <w:t xml:space="preserve">1. </w:t>
       </w:r>
       <w:r>
-        <w:t xml:space="preserve">Start a blank project and select </w:t>
+        <w:t xml:space="preserve">Start MeshCAD and choose </w:t>
+      </w:r>
+      <w:r>
+        <w:rPr>
+          <w:b/>
+        </w:rPr>
+        <w:t>File &gt; New</w:t>
+      </w:r>
+      <w:r>
+        <w:t xml:space="preserve"> if a project is already open.</w:t>
+      </w:r>
+    </w:p>
+    <w:p>
+      <w:pPr>
+        <w:spacing w:after="60"/>
+        <w:ind w:left="346" w:hanging="346"/>
+      </w:pPr>
+      <w:r>
+        <w:t xml:space="preserve">2. </w:t>
+      </w:r>
+      <w:r>
+        <w:t xml:space="preserve">Leave </w:t>
+      </w:r>
+      <w:r>
+        <w:rPr>
+          <w:b/>
+        </w:rPr>
+        <w:t>Show Grid</w:t>
+      </w:r>
+      <w:r>
+        <w:t xml:space="preserve"> enabled. Adjust </w:t>
+      </w:r>
+      <w:r>
+        <w:rPr>
+          <w:b/>
+        </w:rPr>
+        <w:t>Spacing</w:t>
+      </w:r>
+      <w:r>
+        <w:t xml:space="preserve"> if a finer or coarser drawing reference is useful.</w:t>
+      </w:r>
+    </w:p>
+    <w:p>
+      <w:pPr>
+        <w:spacing w:after="60"/>
+        <w:ind w:left="346" w:hanging="346"/>
+      </w:pPr>
+      <w:r>
+        <w:t xml:space="preserve">3. </w:t>
+      </w:r>
+      <w:r>
+        <w:t xml:space="preserve">Click </w:t>
       </w:r>
       <w:r>
         <w:rPr>
@@ -2148,7 +1905,7 @@
         <w:t>Line</w:t>
       </w:r>
       <w:r>
-        <w:t>.</w:t>
+        <w:t>. Draw the four rectangle sides by clicking the lower-left, lower-right, upper-right, upper-left, and lower-left points in sequence. Snap the last click to the first vertex so the contour closes. The Line button remains highlighted while drawing.</w:t>
       </w:r>
     </w:p>
     <w:p>
@@ -2157,46 +1914,10 @@
         <w:ind w:left="346" w:hanging="346"/>
       </w:pPr>
       <w:r>
-        <w:t xml:space="preserve">2. </w:t>
-      </w:r>
-      <w:r>
-        <w:t>Draw the lower outer boundary as two segments: lower-left to the center point, then center to lower-right. The center must be a real vertex where the interface meets the boundary.</w:t>
-      </w:r>
-    </w:p>
-    <w:p>
-      <w:pPr>
-        <w:spacing w:after="60"/>
-        <w:ind w:left="346" w:hanging="346"/>
-      </w:pPr>
-      <w:r>
-        <w:t xml:space="preserve">3. </w:t>
-      </w:r>
-      <w:r>
-        <w:t>Draw the right outer vertical side, the upper boundary as two segments (upper-right to upper-center, then upper-center to upper-left), and the left outer vertical side. Snap endpoints to existing vertices as you close the outline.</w:t>
-      </w:r>
-    </w:p>
-    <w:p>
-      <w:pPr>
-        <w:spacing w:after="60"/>
-        <w:ind w:left="346" w:hanging="346"/>
-      </w:pPr>
-      <w:r>
         <w:t xml:space="preserve">4. </w:t>
       </w:r>
       <w:r>
-        <w:t>Draw the internal vertical interface from the lower-center vertex to the upper-center vertex, snapping to both. The result is a pair of adjacent closed loops. Do not draw a second overlapping copy of this interface.</w:t>
-      </w:r>
-    </w:p>
-    <w:p>
-      <w:pPr>
-        <w:spacing w:after="60"/>
-        <w:ind w:left="346" w:hanging="346"/>
-      </w:pPr>
-      <w:r>
-        <w:t xml:space="preserve">5. </w:t>
-      </w:r>
-      <w:r>
-        <w:t xml:space="preserve">Select </w:t>
+        <w:t xml:space="preserve">Click </w:t>
       </w:r>
       <w:r>
         <w:rPr>
@@ -2205,7 +1926,16 @@
         <w:t>Select</w:t>
       </w:r>
       <w:r>
-        <w:t xml:space="preserve">, then click </w:t>
+        <w:t xml:space="preserve"> to leave line-drawing mode. In the </w:t>
+      </w:r>
+      <w:r>
+        <w:rPr>
+          <w:b/>
+        </w:rPr>
+        <w:t>Loops</w:t>
+      </w:r>
+      <w:r>
+        <w:t xml:space="preserve"> panel, click </w:t>
       </w:r>
       <w:r>
         <w:rPr>
@@ -2214,7 +1944,7 @@
         <w:t>Detect Loops</w:t>
       </w:r>
       <w:r>
-        <w:t>. Select each loop in turn to confirm that it highlights one rectangle.</w:t>
+        <w:t>. Select the detected four-edge loop; it is highlighted green on the canvas.</w:t>
       </w:r>
     </w:p>
     <w:p>
@@ -2223,10 +1953,10 @@
         <w:ind w:left="346" w:hanging="346"/>
       </w:pPr>
       <w:r>
-        <w:t xml:space="preserve">6. </w:t>
-      </w:r>
-      <w:r>
-        <w:t xml:space="preserve">Select the first loop and click </w:t>
+        <w:t xml:space="preserve">5. </w:t>
+      </w:r>
+      <w:r>
+        <w:t xml:space="preserve">Click </w:t>
       </w:r>
       <w:r>
         <w:rPr>
@@ -2235,7 +1965,16 @@
         <w:t>Create Block from Loop</w:t>
       </w:r>
       <w:r>
-        <w:t>. Click its four corner vertices. Repeat for the second loop.</w:t>
+        <w:t xml:space="preserve">, then click the four rectangle vertices. They can be selected in any order, but all four must be distinct. The </w:t>
+      </w:r>
+      <w:r>
+        <w:rPr>
+          <w:b/>
+        </w:rPr>
+        <w:t>Blocks</w:t>
+      </w:r>
+      <w:r>
+        <w:t xml:space="preserve"> panel should show one block.</w:t>
       </w:r>
     </w:p>
     <w:p>
@@ -2244,7 +1983,7 @@
         <w:ind w:left="346" w:hanging="346"/>
       </w:pPr>
       <w:r>
-        <w:t xml:space="preserve">7. </w:t>
+        <w:t xml:space="preserve">6. </w:t>
       </w:r>
       <w:r>
         <w:t xml:space="preserve">In </w:t>
@@ -2256,7 +1995,25 @@
         <w:t>Distributions</w:t>
       </w:r>
       <w:r>
-        <w:t xml:space="preserve">, set all horizontal edges to </w:t>
+        <w:t xml:space="preserve">, click </w:t>
+      </w:r>
+      <w:r>
+        <w:rPr>
+          <w:b/>
+        </w:rPr>
+        <w:t>Refresh Edges</w:t>
+      </w:r>
+      <w:r>
+        <w:t xml:space="preserve"> if needed. Select the lower and upper edges (use Ctrl-click for multiple edges). Set </w:t>
+      </w:r>
+      <w:r>
+        <w:rPr>
+          <w:b/>
+        </w:rPr>
+        <w:t>Nodes</w:t>
+      </w:r>
+      <w:r>
+        <w:t xml:space="preserve"> to </w:t>
       </w:r>
       <w:r>
         <w:rPr>
@@ -2267,7 +2024,55 @@
         <w:t>9</w:t>
       </w:r>
       <w:r>
-        <w:t xml:space="preserve"> uniform nodes and all vertical edges—including the shared interface—to </w:t>
+        <w:t xml:space="preserve">, </w:t>
+      </w:r>
+      <w:r>
+        <w:rPr>
+          <w:b/>
+        </w:rPr>
+        <w:t>Distribution</w:t>
+      </w:r>
+      <w:r>
+        <w:t xml:space="preserve"> to </w:t>
+      </w:r>
+      <w:r>
+        <w:rPr>
+          <w:b/>
+        </w:rPr>
+        <w:t>Uniform</w:t>
+      </w:r>
+      <w:r>
+        <w:t xml:space="preserve">, then click </w:t>
+      </w:r>
+      <w:r>
+        <w:rPr>
+          <w:b/>
+        </w:rPr>
+        <w:t>Apply to Selected</w:t>
+      </w:r>
+      <w:r>
+        <w:t>.</w:t>
+      </w:r>
+    </w:p>
+    <w:p>
+      <w:pPr>
+        <w:spacing w:after="60"/>
+        <w:ind w:left="346" w:hanging="346"/>
+      </w:pPr>
+      <w:r>
+        <w:t xml:space="preserve">7. </w:t>
+      </w:r>
+      <w:r>
+        <w:t xml:space="preserve">Select the left and right edges. Set </w:t>
+      </w:r>
+      <w:r>
+        <w:rPr>
+          <w:b/>
+        </w:rPr>
+        <w:t>Nodes</w:t>
+      </w:r>
+      <w:r>
+        <w:t xml:space="preserve"> to </w:t>
       </w:r>
       <w:r>
         <w:rPr>
@@ -2278,28 +2083,37 @@
         <w:t>6</w:t>
       </w:r>
       <w:r>
-        <w:t xml:space="preserve"> uniform nodes. The shared edge has one specification, used by both blocks.</w:t>
-      </w:r>
-    </w:p>
-    <w:p>
-      <w:pPr>
-        <w:spacing w:after="60"/>
-        <w:ind w:left="346" w:hanging="346"/>
-      </w:pPr>
-      <w:r>
-        <w:t xml:space="preserve">8. </w:t>
-      </w:r>
-      <w:r>
-        <w:t xml:space="preserve">Check the </w:t>
+        <w:t xml:space="preserve">, keep </w:t>
       </w:r>
       <w:r>
         <w:rPr>
           <w:b/>
         </w:rPr>
-        <w:t>Blocks</w:t>
-      </w:r>
-      <w:r>
-        <w:t xml:space="preserve"> panel. Both blocks should report </w:t>
+        <w:t>Uniform</w:t>
+      </w:r>
+      <w:r>
+        <w:t xml:space="preserve">, and click </w:t>
+      </w:r>
+      <w:r>
+        <w:rPr>
+          <w:b/>
+        </w:rPr>
+        <w:t>Apply to Selected</w:t>
+      </w:r>
+      <w:r>
+        <w:t>.</w:t>
+      </w:r>
+    </w:p>
+    <w:p>
+      <w:pPr>
+        <w:spacing w:after="60"/>
+        <w:ind w:left="346" w:hanging="346"/>
+      </w:pPr>
+      <w:r>
+        <w:t xml:space="preserve">8. </w:t>
+      </w:r>
+      <w:r>
+        <w:t xml:space="preserve">Confirm the block status is </w:t>
       </w:r>
       <w:r>
         <w:rPr>
@@ -2310,7 +2124,7 @@
         <w:t>OK (nodes 9 x 6)</w:t>
       </w:r>
       <w:r>
-        <w:t>. Resolve any mismatch before generating.</w:t>
+        <w:t>. If it reports a mismatch, inspect the listed opposite sides and apply matching totals.</w:t>
       </w:r>
     </w:p>
     <w:p>
@@ -2331,7 +2145,18 @@
         <w:t>Generate Mesh</w:t>
       </w:r>
       <w:r>
-        <w:t>. Verify that both grids meet continuously at the shared edge and have the same number of interface nodes.</w:t>
+        <w:t xml:space="preserve">. The canvas should show a structured grid with </w:t>
+      </w:r>
+      <w:r>
+        <w:rPr>
+          <w:rFonts w:ascii="Cascadia Mono" w:hAnsi="Cascadia Mono"/>
+          <w:color w:val="80371E"/>
+          <w:sz w:val="17"/>
+        </w:rPr>
+        <w:t>(9 - 1) x (6 - 1) = 40</w:t>
+      </w:r>
+      <w:r>
+        <w:t xml:space="preserve"> cells.</w:t>
       </w:r>
     </w:p>
     <w:p>
@@ -2343,28 +2168,7 @@
         <w:t xml:space="preserve">10. </w:t>
       </w:r>
       <w:r>
-        <w:t xml:space="preserve">Select </w:t>
-      </w:r>
-      <w:r>
-        <w:rPr>
-          <w:b/>
-        </w:rPr>
-        <w:t>Select</w:t>
-      </w:r>
-      <w:r>
-        <w:t xml:space="preserve"> and drag an exterior vertex to adjust the geometry. Generated meshes update when the geometry changes; regenerate if needed after changing mesh settings.</w:t>
-      </w:r>
-    </w:p>
-    <w:p>
-      <w:pPr>
-        <w:spacing w:after="60"/>
-        <w:ind w:left="346" w:hanging="346"/>
-      </w:pPr>
-      <w:r>
-        <w:t xml:space="preserve">11. </w:t>
-      </w:r>
-      <w:r>
-        <w:t xml:space="preserve">Save the project with </w:t>
+        <w:t xml:space="preserve">Choose </w:t>
       </w:r>
       <w:r>
         <w:rPr>
@@ -2373,7 +2177,18 @@
         <w:t>File &gt; Save As</w:t>
       </w:r>
       <w:r>
-        <w:t>.</w:t>
+        <w:t xml:space="preserve"> and save the project as a </w:t>
+      </w:r>
+      <w:r>
+        <w:rPr>
+          <w:rFonts w:ascii="Cascadia Mono" w:hAnsi="Cascadia Mono"/>
+          <w:color w:val="80371E"/>
+          <w:sz w:val="17"/>
+        </w:rPr>
+        <w:t>.json</w:t>
+      </w:r>
+      <w:r>
+        <w:t xml:space="preserve"> file.</w:t>
       </w:r>
     </w:p>
     <w:p>
@@ -2386,7 +2201,7 @@
         <w:pStyle w:val="Heading2"/>
       </w:pPr>
       <w:r>
-        <w:t>Tutorial 3: Biasing a Boundary and Improving the Mesh</w:t>
+        <w:t>Tutorial 2: Two Conformal Blocks and a Shared Interface</w:t>
       </w:r>
     </w:p>
     <w:p>
@@ -2397,12 +2212,12 @@
         <w:t>Goal:</w:t>
       </w:r>
       <w:r>
-        <w:t xml:space="preserve"> Compare a uniform mesh against a graded mesh with boundary orthogonalization and smoothing.</w:t>
+        <w:t xml:space="preserve"> Create two side-by-side rectangular blocks that share one edge and have matching interface nodes.</w:t>
       </w:r>
     </w:p>
     <w:p>
       <w:pPr>
-        <w:spacing w:before="40" w:after="20"/>
+        <w:spacing w:after="20"/>
         <w:jc w:val="center"/>
       </w:pPr>
       <w:r>
@@ -2417,7 +2232,7 @@
               <a:graphicData uri="http://schemas.openxmlformats.org/drawingml/2006/picture">
                 <pic:pic>
                   <pic:nvPicPr>
-                    <pic:cNvPr id="0" name="tutorial-3-mesh-improvement.png"/>
+                    <pic:cNvPr id="0" name="tutorial-2-shared-interface.png"/>
                     <pic:cNvPicPr/>
                   </pic:nvPicPr>
                   <pic:blipFill>
@@ -2451,7 +2266,7 @@
           <w:color w:val="5A6473"/>
           <w:sz w:val="16"/>
         </w:rPr>
-        <w:t>MeshCAD showing a curved block mesh with biased spacing, orthogonalization, and smoothing enabled.</w:t>
+        <w:t>MeshCAD showing two structured blocks joined at a conformal shared interface.</w:t>
       </w:r>
     </w:p>
     <w:p>
@@ -2463,7 +2278,16 @@
         <w:t xml:space="preserve">1. </w:t>
       </w:r>
       <w:r>
-        <w:t>Open the project from Tutorial 1 or 2, or create a block and generate its uniform baseline mesh.</w:t>
+        <w:t xml:space="preserve">Start a blank project and select </w:t>
+      </w:r>
+      <w:r>
+        <w:rPr>
+          <w:b/>
+        </w:rPr>
+        <w:t>Line</w:t>
+      </w:r>
+      <w:r>
+        <w:t>.</w:t>
       </w:r>
     </w:p>
     <w:p>
@@ -2473,6 +2297,93 @@
       </w:pPr>
       <w:r>
         <w:t xml:space="preserve">2. </w:t>
+      </w:r>
+      <w:r>
+        <w:t>Draw the lower outer boundary as two segments: lower-left to the center point, then center to lower-right. The center must be a real vertex where the interface meets the boundary.</w:t>
+      </w:r>
+    </w:p>
+    <w:p>
+      <w:pPr>
+        <w:spacing w:after="60"/>
+        <w:ind w:left="346" w:hanging="346"/>
+      </w:pPr>
+      <w:r>
+        <w:t xml:space="preserve">3. </w:t>
+      </w:r>
+      <w:r>
+        <w:t>Draw the right outer vertical side, the upper boundary as two segments (upper-right to upper-center, then upper-center to upper-left), and the left outer vertical side. Snap endpoints to existing vertices as you close the outline.</w:t>
+      </w:r>
+    </w:p>
+    <w:p>
+      <w:pPr>
+        <w:spacing w:after="60"/>
+        <w:ind w:left="346" w:hanging="346"/>
+      </w:pPr>
+      <w:r>
+        <w:t xml:space="preserve">4. </w:t>
+      </w:r>
+      <w:r>
+        <w:t>Draw the internal vertical interface from the lower-center vertex to the upper-center vertex, snapping to both. The result is a pair of adjacent closed loops. Do not draw a second overlapping copy of this interface.</w:t>
+      </w:r>
+    </w:p>
+    <w:p>
+      <w:pPr>
+        <w:spacing w:after="60"/>
+        <w:ind w:left="346" w:hanging="346"/>
+      </w:pPr>
+      <w:r>
+        <w:t xml:space="preserve">5. </w:t>
+      </w:r>
+      <w:r>
+        <w:t xml:space="preserve">Select </w:t>
+      </w:r>
+      <w:r>
+        <w:rPr>
+          <w:b/>
+        </w:rPr>
+        <w:t>Select</w:t>
+      </w:r>
+      <w:r>
+        <w:t xml:space="preserve">, then click </w:t>
+      </w:r>
+      <w:r>
+        <w:rPr>
+          <w:b/>
+        </w:rPr>
+        <w:t>Detect Loops</w:t>
+      </w:r>
+      <w:r>
+        <w:t>. Select each loop in turn to confirm that it highlights one rectangle.</w:t>
+      </w:r>
+    </w:p>
+    <w:p>
+      <w:pPr>
+        <w:spacing w:after="60"/>
+        <w:ind w:left="346" w:hanging="346"/>
+      </w:pPr>
+      <w:r>
+        <w:t xml:space="preserve">6. </w:t>
+      </w:r>
+      <w:r>
+        <w:t xml:space="preserve">Select the first loop and click </w:t>
+      </w:r>
+      <w:r>
+        <w:rPr>
+          <w:b/>
+        </w:rPr>
+        <w:t>Create Block from Loop</w:t>
+      </w:r>
+      <w:r>
+        <w:t>. Click its four corner vertices. Repeat for the second loop.</w:t>
+      </w:r>
+    </w:p>
+    <w:p>
+      <w:pPr>
+        <w:spacing w:after="60"/>
+        <w:ind w:left="346" w:hanging="346"/>
+      </w:pPr>
+      <w:r>
+        <w:t xml:space="preserve">7. </w:t>
       </w:r>
       <w:r>
         <w:t xml:space="preserve">In </w:t>
@@ -2484,34 +2395,7 @@
         <w:t>Distributions</w:t>
       </w:r>
       <w:r>
-        <w:t xml:space="preserve">, select one exterior edge. The selected edge is highlighted on the canvas. Set </w:t>
-      </w:r>
-      <w:r>
-        <w:rPr>
-          <w:b/>
-        </w:rPr>
-        <w:t>Distribution</w:t>
-      </w:r>
-      <w:r>
-        <w:t xml:space="preserve"> to </w:t>
-      </w:r>
-      <w:r>
-        <w:rPr>
-          <w:b/>
-        </w:rPr>
-        <w:t>Biased</w:t>
-      </w:r>
-      <w:r>
-        <w:t xml:space="preserve">, set </w:t>
-      </w:r>
-      <w:r>
-        <w:rPr>
-          <w:b/>
-        </w:rPr>
-        <w:t>Bias</w:t>
-      </w:r>
-      <w:r>
-        <w:t xml:space="preserve"> to </w:t>
+        <w:t xml:space="preserve">, set all horizontal edges to </w:t>
       </w:r>
       <w:r>
         <w:rPr>
@@ -2519,31 +2403,10 @@
           <w:color w:val="80371E"/>
           <w:sz w:val="17"/>
         </w:rPr>
-        <w:t>2.0</w:t>
-      </w:r>
-      <w:r>
-        <w:t xml:space="preserve">, and click </w:t>
-      </w:r>
-      <w:r>
-        <w:rPr>
-          <w:b/>
-        </w:rPr>
-        <w:t>Apply to Selected</w:t>
-      </w:r>
-      <w:r>
-        <w:t>.</w:t>
-      </w:r>
-    </w:p>
-    <w:p>
-      <w:pPr>
-        <w:spacing w:after="60"/>
-        <w:ind w:left="346" w:hanging="346"/>
-      </w:pPr>
-      <w:r>
-        <w:t xml:space="preserve">3. </w:t>
-      </w:r>
-      <w:r>
-        <w:t xml:space="preserve">The bias direction follows the edge's start-to-end direction: a bias greater than </w:t>
+        <w:t>9</w:t>
+      </w:r>
+      <w:r>
+        <w:t xml:space="preserve"> uniform nodes and all vertical edges—including the shared interface—to </w:t>
       </w:r>
       <w:r>
         <w:rPr>
@@ -2551,10 +2414,10 @@
           <w:color w:val="80371E"/>
           <w:sz w:val="17"/>
         </w:rPr>
-        <w:t>1</w:t>
-      </w:r>
-      <w:r>
-        <w:t xml:space="preserve"> concentrates nodes near the start. The direction in which an edge was drawn therefore determines which endpoint receives finer spacing.</w:t>
+        <w:t>6</w:t>
+      </w:r>
+      <w:r>
+        <w:t xml:space="preserve"> uniform nodes. The shared edge has one specification, used by both blocks.</w:t>
       </w:r>
     </w:p>
     <w:p>
@@ -2563,40 +2426,19 @@
         <w:ind w:left="346" w:hanging="346"/>
       </w:pPr>
       <w:r>
-        <w:t xml:space="preserve">4. </w:t>
-      </w:r>
-      <w:r>
-        <w:t>Keep opposite sides' node totals compatible. Generate the mesh and compare cell spacing with the uniform baseline.</w:t>
-      </w:r>
-    </w:p>
-    <w:p>
-      <w:pPr>
-        <w:spacing w:after="60"/>
-        <w:ind w:left="346" w:hanging="346"/>
-      </w:pPr>
-      <w:r>
-        <w:t xml:space="preserve">5. </w:t>
-      </w:r>
-      <w:r>
-        <w:t xml:space="preserve">Enable </w:t>
+        <w:t xml:space="preserve">8. </w:t>
+      </w:r>
+      <w:r>
+        <w:t xml:space="preserve">Check the </w:t>
       </w:r>
       <w:r>
         <w:rPr>
           <w:b/>
         </w:rPr>
-        <w:t>Orthogonal</w:t>
-      </w:r>
-      <w:r>
-        <w:t xml:space="preserve">. Set </w:t>
-      </w:r>
-      <w:r>
-        <w:rPr>
-          <w:b/>
-        </w:rPr>
-        <w:t>Layers</w:t>
-      </w:r>
-      <w:r>
-        <w:t xml:space="preserve"> to </w:t>
+        <w:t>Blocks</w:t>
+      </w:r>
+      <w:r>
+        <w:t xml:space="preserve"> panel. Both blocks should report </w:t>
       </w:r>
       <w:r>
         <w:rPr>
@@ -2604,30 +2446,31 @@
           <w:color w:val="80371E"/>
           <w:sz w:val="17"/>
         </w:rPr>
-        <w:t>3</w:t>
-      </w:r>
-      <w:r>
-        <w:t xml:space="preserve"> and </w:t>
+        <w:t>OK (nodes 9 x 6)</w:t>
+      </w:r>
+      <w:r>
+        <w:t>. Resolve any mismatch before generating.</w:t>
+      </w:r>
+    </w:p>
+    <w:p>
+      <w:pPr>
+        <w:spacing w:after="60"/>
+        <w:ind w:left="346" w:hanging="346"/>
+      </w:pPr>
+      <w:r>
+        <w:t xml:space="preserve">9. </w:t>
+      </w:r>
+      <w:r>
+        <w:t xml:space="preserve">Click </w:t>
       </w:r>
       <w:r>
         <w:rPr>
           <w:b/>
         </w:rPr>
-        <w:t>Strength</w:t>
-      </w:r>
-      <w:r>
-        <w:t xml:space="preserve"> to </w:t>
-      </w:r>
-      <w:r>
-        <w:rPr>
-          <w:rFonts w:ascii="Cascadia Mono" w:hAnsi="Cascadia Mono"/>
-          <w:color w:val="80371E"/>
-          <w:sz w:val="17"/>
-        </w:rPr>
-        <w:t>0.80</w:t>
-      </w:r>
-      <w:r>
-        <w:t>. Mesh improvement controls update the generated mesh live when blocks exist.</w:t>
+        <w:t>Generate Mesh</w:t>
+      </w:r>
+      <w:r>
+        <w:t>. Verify that both grids meet continuously at the shared edge and have the same number of interface nodes.</w:t>
       </w:r>
     </w:p>
     <w:p>
@@ -2636,110 +2479,53 @@
         <w:ind w:left="346" w:hanging="346"/>
       </w:pPr>
       <w:r>
-        <w:t xml:space="preserve">6. </w:t>
-      </w:r>
-      <w:r>
-        <w:t xml:space="preserve">Set </w:t>
+        <w:t xml:space="preserve">10. </w:t>
+      </w:r>
+      <w:r>
+        <w:t xml:space="preserve">Select </w:t>
       </w:r>
       <w:r>
         <w:rPr>
           <w:b/>
         </w:rPr>
-        <w:t>Smoothing</w:t>
-      </w:r>
-      <w:r>
-        <w:t xml:space="preserve"> to </w:t>
-      </w:r>
-      <w:r>
-        <w:rPr>
-          <w:rFonts w:ascii="Cascadia Mono" w:hAnsi="Cascadia Mono"/>
-          <w:color w:val="80371E"/>
-          <w:sz w:val="17"/>
-        </w:rPr>
-        <w:t>40</w:t>
-      </w:r>
-      <w:r>
-        <w:t xml:space="preserve"> iterations and </w:t>
+        <w:t>Select</w:t>
+      </w:r>
+      <w:r>
+        <w:t xml:space="preserve"> and drag an exterior vertex to adjust the geometry. Generated meshes update when the geometry changes; regenerate if needed after changing mesh settings.</w:t>
+      </w:r>
+    </w:p>
+    <w:p>
+      <w:pPr>
+        <w:spacing w:after="60"/>
+        <w:ind w:left="346" w:hanging="346"/>
+      </w:pPr>
+      <w:r>
+        <w:t xml:space="preserve">11. </w:t>
+      </w:r>
+      <w:r>
+        <w:t xml:space="preserve">Save the project with </w:t>
       </w:r>
       <w:r>
         <w:rPr>
           <w:b/>
         </w:rPr>
-        <w:t>Relaxation</w:t>
-      </w:r>
-      <w:r>
-        <w:t xml:space="preserve"> to </w:t>
-      </w:r>
-      <w:r>
-        <w:rPr>
-          <w:rFonts w:ascii="Cascadia Mono" w:hAnsi="Cascadia Mono"/>
-          <w:color w:val="80371E"/>
-          <w:sz w:val="17"/>
-        </w:rPr>
-        <w:t>0.40</w:t>
-      </w:r>
-      <w:r>
-        <w:t>. Observe how interior lines change while boundary nodes remain fixed.</w:t>
+        <w:t>File &gt; Save As</w:t>
+      </w:r>
+      <w:r>
+        <w:t>.</w:t>
       </w:r>
     </w:p>
     <w:p>
-      <w:pPr>
-        <w:spacing w:after="60"/>
-        <w:ind w:left="346" w:hanging="346"/>
-      </w:pPr>
-      <w:r>
-        <w:t xml:space="preserve">7. </w:t>
-      </w:r>
-      <w:r>
-        <w:t xml:space="preserve">Compare with orthogonality disabled and smoothing set to </w:t>
-      </w:r>
-      <w:r>
-        <w:rPr>
-          <w:rFonts w:ascii="Cascadia Mono" w:hAnsi="Cascadia Mono"/>
-          <w:color w:val="80371E"/>
-          <w:sz w:val="17"/>
-        </w:rPr>
-        <w:t>0</w:t>
-      </w:r>
-      <w:r>
-        <w:t>. Change one setting at a time so its effect is clear.</w:t>
+      <w:r>
+        <w:br w:type="page"/>
       </w:r>
     </w:p>
     <w:p>
       <w:pPr>
-        <w:spacing w:after="60"/>
-        <w:ind w:left="346" w:hanging="346"/>
-      </w:pPr>
-      <w:r>
-        <w:t xml:space="preserve">8. </w:t>
-      </w:r>
-      <w:r>
-        <w:t>Inspect for crossed/inverted cells, abrupt size jumps, irregular interior lines, poor angles near boundaries, and discontinuities across block interfaces. Reduce bias, strength, iterations, or relaxation if the grid becomes distorted.</w:t>
-      </w:r>
-    </w:p>
-    <w:p>
-      <w:pPr>
-        <w:spacing w:after="60"/>
-        <w:ind w:left="346" w:hanging="346"/>
-      </w:pPr>
-      <w:r>
-        <w:t xml:space="preserve">9. </w:t>
-      </w:r>
-      <w:r>
-        <w:t>Save the project after choosing acceptable settings.</w:t>
-      </w:r>
-    </w:p>
-    <w:p>
-      <w:r>
-        <w:br w:type="page"/>
-      </w:r>
-    </w:p>
-    <w:p>
-      <w:pPr>
         <w:pStyle w:val="Heading2"/>
       </w:pPr>
       <w:r>
-        <w:t>Tutorial 4: Boundary Patches and Mesh Export</w:t>
+        <w:t>Tutorial 3: Biasing a Boundary and Improving the Mesh</w:t>
       </w:r>
     </w:p>
     <w:p>
@@ -2750,12 +2536,12 @@
         <w:t>Goal:</w:t>
       </w:r>
       <w:r>
-        <w:t xml:space="preserve"> Assign exterior edges to a named boundary, save the project, and export the mesh for visualization or CFD.</w:t>
+        <w:t xml:space="preserve"> Compare a uniform mesh against a graded mesh with boundary orthogonalization and smoothing.</w:t>
       </w:r>
     </w:p>
     <w:p>
       <w:pPr>
-        <w:spacing w:before="40" w:after="20"/>
+        <w:spacing w:after="20"/>
         <w:jc w:val="center"/>
       </w:pPr>
       <w:r>
@@ -2770,7 +2556,7 @@
               <a:graphicData uri="http://schemas.openxmlformats.org/drawingml/2006/picture">
                 <pic:pic>
                   <pic:nvPicPr>
-                    <pic:cNvPr id="0" name="tutorial-4-boundary-patches.png"/>
+                    <pic:cNvPr id="0" name="tutorial-3-mesh-improvement.png"/>
                     <pic:cNvPicPr/>
                   </pic:nvPicPr>
                   <pic:blipFill>
@@ -2804,6 +2590,359 @@
           <w:color w:val="5A6473"/>
           <w:sz w:val="16"/>
         </w:rPr>
+        <w:t>MeshCAD showing a curved block mesh with biased spacing, orthogonalization, and smoothing enabled.</w:t>
+      </w:r>
+    </w:p>
+    <w:p>
+      <w:pPr>
+        <w:spacing w:after="60"/>
+        <w:ind w:left="346" w:hanging="346"/>
+      </w:pPr>
+      <w:r>
+        <w:t xml:space="preserve">1. </w:t>
+      </w:r>
+      <w:r>
+        <w:t>Open the project from Tutorial 1 or 2, or create a block and generate its uniform baseline mesh.</w:t>
+      </w:r>
+    </w:p>
+    <w:p>
+      <w:pPr>
+        <w:spacing w:after="60"/>
+        <w:ind w:left="346" w:hanging="346"/>
+      </w:pPr>
+      <w:r>
+        <w:t xml:space="preserve">2. </w:t>
+      </w:r>
+      <w:r>
+        <w:t xml:space="preserve">In </w:t>
+      </w:r>
+      <w:r>
+        <w:rPr>
+          <w:b/>
+        </w:rPr>
+        <w:t>Distributions</w:t>
+      </w:r>
+      <w:r>
+        <w:t xml:space="preserve">, select one exterior edge. The selected edge is highlighted on the canvas. Set </w:t>
+      </w:r>
+      <w:r>
+        <w:rPr>
+          <w:b/>
+        </w:rPr>
+        <w:t>Distribution</w:t>
+      </w:r>
+      <w:r>
+        <w:t xml:space="preserve"> to </w:t>
+      </w:r>
+      <w:r>
+        <w:rPr>
+          <w:b/>
+        </w:rPr>
+        <w:t>Biased</w:t>
+      </w:r>
+      <w:r>
+        <w:t xml:space="preserve">, set </w:t>
+      </w:r>
+      <w:r>
+        <w:rPr>
+          <w:b/>
+        </w:rPr>
+        <w:t>Bias</w:t>
+      </w:r>
+      <w:r>
+        <w:t xml:space="preserve"> to </w:t>
+      </w:r>
+      <w:r>
+        <w:rPr>
+          <w:rFonts w:ascii="Cascadia Mono" w:hAnsi="Cascadia Mono"/>
+          <w:color w:val="80371E"/>
+          <w:sz w:val="17"/>
+        </w:rPr>
+        <w:t>2.0</w:t>
+      </w:r>
+      <w:r>
+        <w:t xml:space="preserve">, and click </w:t>
+      </w:r>
+      <w:r>
+        <w:rPr>
+          <w:b/>
+        </w:rPr>
+        <w:t>Apply to Selected</w:t>
+      </w:r>
+      <w:r>
+        <w:t>.</w:t>
+      </w:r>
+    </w:p>
+    <w:p>
+      <w:pPr>
+        <w:spacing w:after="60"/>
+        <w:ind w:left="346" w:hanging="346"/>
+      </w:pPr>
+      <w:r>
+        <w:t xml:space="preserve">3. </w:t>
+      </w:r>
+      <w:r>
+        <w:t xml:space="preserve">The bias direction follows the edge's start-to-end direction: a bias greater than </w:t>
+      </w:r>
+      <w:r>
+        <w:rPr>
+          <w:rFonts w:ascii="Cascadia Mono" w:hAnsi="Cascadia Mono"/>
+          <w:color w:val="80371E"/>
+          <w:sz w:val="17"/>
+        </w:rPr>
+        <w:t>1</w:t>
+      </w:r>
+      <w:r>
+        <w:t xml:space="preserve"> concentrates nodes near the start. The direction in which an edge was drawn therefore determines which endpoint receives finer spacing.</w:t>
+      </w:r>
+    </w:p>
+    <w:p>
+      <w:pPr>
+        <w:spacing w:after="60"/>
+        <w:ind w:left="346" w:hanging="346"/>
+      </w:pPr>
+      <w:r>
+        <w:t xml:space="preserve">4. </w:t>
+      </w:r>
+      <w:r>
+        <w:t>Keep opposite sides' node totals compatible. Generate the mesh and compare cell spacing with the uniform baseline.</w:t>
+      </w:r>
+    </w:p>
+    <w:p>
+      <w:pPr>
+        <w:spacing w:after="60"/>
+        <w:ind w:left="346" w:hanging="346"/>
+      </w:pPr>
+      <w:r>
+        <w:t xml:space="preserve">5. </w:t>
+      </w:r>
+      <w:r>
+        <w:t xml:space="preserve">Enable </w:t>
+      </w:r>
+      <w:r>
+        <w:rPr>
+          <w:b/>
+        </w:rPr>
+        <w:t>Orthogonal</w:t>
+      </w:r>
+      <w:r>
+        <w:t xml:space="preserve">. Set </w:t>
+      </w:r>
+      <w:r>
+        <w:rPr>
+          <w:b/>
+        </w:rPr>
+        <w:t>Layers</w:t>
+      </w:r>
+      <w:r>
+        <w:t xml:space="preserve"> to </w:t>
+      </w:r>
+      <w:r>
+        <w:rPr>
+          <w:rFonts w:ascii="Cascadia Mono" w:hAnsi="Cascadia Mono"/>
+          <w:color w:val="80371E"/>
+          <w:sz w:val="17"/>
+        </w:rPr>
+        <w:t>3</w:t>
+      </w:r>
+      <w:r>
+        <w:t xml:space="preserve"> and </w:t>
+      </w:r>
+      <w:r>
+        <w:rPr>
+          <w:b/>
+        </w:rPr>
+        <w:t>Strength</w:t>
+      </w:r>
+      <w:r>
+        <w:t xml:space="preserve"> to </w:t>
+      </w:r>
+      <w:r>
+        <w:rPr>
+          <w:rFonts w:ascii="Cascadia Mono" w:hAnsi="Cascadia Mono"/>
+          <w:color w:val="80371E"/>
+          <w:sz w:val="17"/>
+        </w:rPr>
+        <w:t>0.80</w:t>
+      </w:r>
+      <w:r>
+        <w:t>. Mesh improvement controls update the generated mesh live when blocks exist.</w:t>
+      </w:r>
+    </w:p>
+    <w:p>
+      <w:pPr>
+        <w:spacing w:after="60"/>
+        <w:ind w:left="346" w:hanging="346"/>
+      </w:pPr>
+      <w:r>
+        <w:t xml:space="preserve">6. </w:t>
+      </w:r>
+      <w:r>
+        <w:t xml:space="preserve">Set </w:t>
+      </w:r>
+      <w:r>
+        <w:rPr>
+          <w:b/>
+        </w:rPr>
+        <w:t>Smoothing</w:t>
+      </w:r>
+      <w:r>
+        <w:t xml:space="preserve"> to </w:t>
+      </w:r>
+      <w:r>
+        <w:rPr>
+          <w:rFonts w:ascii="Cascadia Mono" w:hAnsi="Cascadia Mono"/>
+          <w:color w:val="80371E"/>
+          <w:sz w:val="17"/>
+        </w:rPr>
+        <w:t>40</w:t>
+      </w:r>
+      <w:r>
+        <w:t xml:space="preserve"> iterations and </w:t>
+      </w:r>
+      <w:r>
+        <w:rPr>
+          <w:b/>
+        </w:rPr>
+        <w:t>Relaxation</w:t>
+      </w:r>
+      <w:r>
+        <w:t xml:space="preserve"> to </w:t>
+      </w:r>
+      <w:r>
+        <w:rPr>
+          <w:rFonts w:ascii="Cascadia Mono" w:hAnsi="Cascadia Mono"/>
+          <w:color w:val="80371E"/>
+          <w:sz w:val="17"/>
+        </w:rPr>
+        <w:t>0.40</w:t>
+      </w:r>
+      <w:r>
+        <w:t>. Observe how interior lines change while boundary nodes remain fixed.</w:t>
+      </w:r>
+    </w:p>
+    <w:p>
+      <w:pPr>
+        <w:spacing w:after="60"/>
+        <w:ind w:left="346" w:hanging="346"/>
+      </w:pPr>
+      <w:r>
+        <w:t xml:space="preserve">7. </w:t>
+      </w:r>
+      <w:r>
+        <w:t xml:space="preserve">Compare with orthogonality disabled and smoothing set to </w:t>
+      </w:r>
+      <w:r>
+        <w:rPr>
+          <w:rFonts w:ascii="Cascadia Mono" w:hAnsi="Cascadia Mono"/>
+          <w:color w:val="80371E"/>
+          <w:sz w:val="17"/>
+        </w:rPr>
+        <w:t>0</w:t>
+      </w:r>
+      <w:r>
+        <w:t>. Change one setting at a time so its effect is clear.</w:t>
+      </w:r>
+    </w:p>
+    <w:p>
+      <w:pPr>
+        <w:spacing w:after="60"/>
+        <w:ind w:left="346" w:hanging="346"/>
+      </w:pPr>
+      <w:r>
+        <w:t xml:space="preserve">8. </w:t>
+      </w:r>
+      <w:r>
+        <w:t>Inspect for crossed/inverted cells, abrupt size jumps, irregular interior lines, poor angles near boundaries, and discontinuities across block interfaces. Reduce bias, strength, iterations, or relaxation if the grid becomes distorted.</w:t>
+      </w:r>
+    </w:p>
+    <w:p>
+      <w:pPr>
+        <w:spacing w:after="60"/>
+        <w:ind w:left="346" w:hanging="346"/>
+      </w:pPr>
+      <w:r>
+        <w:t xml:space="preserve">9. </w:t>
+      </w:r>
+      <w:r>
+        <w:t>Save the project after choosing acceptable settings.</w:t>
+      </w:r>
+    </w:p>
+    <w:p>
+      <w:r>
+        <w:br w:type="page"/>
+      </w:r>
+    </w:p>
+    <w:p>
+      <w:pPr>
+        <w:pStyle w:val="Heading2"/>
+      </w:pPr>
+      <w:r>
+        <w:t>Tutorial 4: Boundary Patches and Mesh Export</w:t>
+      </w:r>
+    </w:p>
+    <w:p>
+      <w:r>
+        <w:rPr>
+          <w:b/>
+        </w:rPr>
+        <w:t>Goal:</w:t>
+      </w:r>
+      <w:r>
+        <w:t xml:space="preserve"> Assign exterior edges to a named boundary, save the project, and export the mesh for visualization or CFD.</w:t>
+      </w:r>
+    </w:p>
+    <w:p>
+      <w:pPr>
+        <w:spacing w:after="20"/>
+        <w:jc w:val="center"/>
+      </w:pPr>
+      <w:r>
+        <w:drawing>
+          <wp:inline xmlns:a="http://schemas.openxmlformats.org/drawingml/2006/main" xmlns:pic="http://schemas.openxmlformats.org/drawingml/2006/picture">
+            <wp:extent cx="6035040" cy="3195021"/>
+            <wp:docPr id="5" name="Picture 5"/>
+            <wp:cNvGraphicFramePr>
+              <a:graphicFrameLocks noChangeAspect="1"/>
+            </wp:cNvGraphicFramePr>
+            <a:graphic>
+              <a:graphicData uri="http://schemas.openxmlformats.org/drawingml/2006/picture">
+                <pic:pic>
+                  <pic:nvPicPr>
+                    <pic:cNvPr id="0" name="tutorial-4-boundary-patches.png"/>
+                    <pic:cNvPicPr/>
+                  </pic:nvPicPr>
+                  <pic:blipFill>
+                    <a:blip r:embed="rId15"/>
+                    <a:stretch>
+                      <a:fillRect/>
+                    </a:stretch>
+                  </pic:blipFill>
+                  <pic:spPr>
+                    <a:xfrm>
+                      <a:off x="0" y="0"/>
+                      <a:ext cx="6035040" cy="3195021"/>
+                    </a:xfrm>
+                    <a:prstGeom prst="rect"/>
+                  </pic:spPr>
+                </pic:pic>
+              </a:graphicData>
+            </a:graphic>
+          </wp:inline>
+        </w:drawing>
+      </w:r>
+    </w:p>
+    <w:p>
+      <w:pPr>
+        <w:spacing w:after="100"/>
+        <w:jc w:val="center"/>
+      </w:pPr>
+      <w:r>
+        <w:rPr>
+          <w:i/>
+          <w:color w:val="5A6473"/>
+          <w:sz w:val="16"/>
+        </w:rPr>
         <w:t>MeshCAD showing the inlet patch selected and its exterior edge highlighted on the mesh.</w:t>
       </w:r>
     </w:p>
@@ -3505,6 +3644,24 @@
       </w:r>
       <w:r>
         <w:t xml:space="preserve"> cancel the active tool.</w:t>
+      </w:r>
+    </w:p>
+    <w:p>
+      <w:pPr>
+        <w:spacing w:after="60"/>
+        <w:ind w:left="346" w:hanging="346"/>
+      </w:pPr>
+      <w:r>
+        <w:t xml:space="preserve">• </w:t>
+      </w:r>
+      <w:r>
+        <w:rPr>
+          <w:b/>
+        </w:rPr>
+        <w:t>File &gt; Import Point Sequence:</w:t>
+      </w:r>
+      <w:r>
+        <w:t xml:space="preserve"> preview and import an ordered CSV/TXT curve.</w:t>
       </w:r>
     </w:p>
     <w:p>

</xml_diff>

<commit_message>
Add edge splitting and consistent mesh redistribution
Document shared-edge splitting and node redistribution workflows.

Co-authored-by: Copilot <223556219+Copilot@users.noreply.github.com>
</commit_message>
<xml_diff>
--- a/docs/MeshCAD_User_Manual.docx
+++ b/docs/MeshCAD_User_Manual.docx
@@ -309,6 +309,12 @@
           <w:sz w:val="18"/>
         </w:rPr>
         <w:t>Tutorial 4: Boundary Patches and Mesh Export</w:t>
+      </w:r>
+    </w:p>
+    <w:p>
+      <w:pPr/>
+      <w:r>
+        <w:t>Tutorial 5: Split a Shared Edge and Rebalance the Mesh</w:t>
       </w:r>
     </w:p>
     <w:p>
@@ -1218,21 +1224,12 @@
     </w:p>
     <w:p>
       <w:r>
-        <w:t xml:space="preserve">Select a loop and click </w:t>
-      </w:r>
-      <w:r>
-        <w:rPr>
-          <w:b/>
-        </w:rPr>
-        <w:t>Create Block from Loop</w:t>
-      </w:r>
-      <w:r>
-        <w:t>. Click four distinct loop vertices. These vertices define the four logical corners. The portions of the loop between consecutive corners become the four block sides.</w:t>
+        <w:t>Select a loop and click Create Block from Loop. Click four distinct loop vertices to define the four logical corners. The portions of the loop between consecutive corners become the four block sides. A loop may contain more than four edges: all intervening edges are grouped into the corresponding side.</w:t>
       </w:r>
     </w:p>
     <w:p>
       <w:r>
-        <w:t>A block side may contain one or several CAD edges.</w:t>
+        <w:t>A block side may contain one or several CAD edges. The block itself always has four logical sides.</w:t>
       </w:r>
     </w:p>
     <w:p>
@@ -1390,7 +1387,27 @@
     </w:p>
     <w:p>
       <w:r>
-        <w:t>A shared edge has one distribution specification, so adjacent blocks automatically use the same interface nodes.</w:t>
+        <w:t>A shared edge has one distribution specification, so adjacent blocks automatically use the same interface nodes. Changing its node count updates the opposite sides of every block that uses that edge. When an opposite side contains multiple edges, the required intervals are distributed across them in proportion to their lengths. Requested values in a multi-edge update are kept fixed; if they conflict with a block side total, MeshCAD reports the conflict and leaves existing settings unchanged.</w:t>
+      </w:r>
+    </w:p>
+    <w:p>
+      <w:pPr>
+        <w:pStyle w:val="Heading3"/>
+      </w:pPr>
+      <w:r>
+        <w:t>Split an Edge</w:t>
+      </w:r>
+    </w:p>
+    <w:p>
+      <w:pPr/>
+      <w:r>
+        <w:t>Select exactly one edge in the Distributions panel. Choose Split Edge on the toolbar or Split Selected Edge by Clicking in the panel, then click within the selected edge. Alternatively, choose Split Selected Edge at Coordinates and enter a point on the edge. Points at or too near an endpoint are rejected.</w:t>
+      </w:r>
+    </w:p>
+    <w:p>
+      <w:pPr/>
+      <w:r>
+        <w:t>The split creates two consecutive edges and preserves the original curve shape. Block sides using the edge are updated, including shared interfaces traversed in opposite directions, and exterior patch membership is preserved on both child edges. The existing intervals are apportioned according to the child lengths; the split adds a node. Opposite block sides are adjusted to preserve compatible node totals.</w:t>
       </w:r>
     </w:p>
     <w:p>
@@ -3211,6 +3228,68 @@
       </w:r>
       <w:r>
         <w:t>If an export is unavailable, confirm that a valid block and generated mesh exist, correct all block mismatches, and try again.</w:t>
+      </w:r>
+    </w:p>
+    <w:p>
+      <w:pPr>
+        <w:pStyle w:val="Heading2"/>
+      </w:pPr>
+      <w:r>
+        <w:t>Tutorial 5: Split a Shared Edge and Rebalance the Mesh</w:t>
+      </w:r>
+    </w:p>
+    <w:p>
+      <w:pPr/>
+      <w:r>
+        <w:t>Goal: Split the interface shared by two blocks, then change one of its segments and verify that both blocks remain compatible.</w:t>
+      </w:r>
+    </w:p>
+    <w:p>
+      <w:pPr/>
+      <w:r>
+        <w:t>1. Complete Tutorial 2 and confirm that both blocks show OK (nodes 9 x 6). Save a copy of the project before experimenting.</w:t>
+      </w:r>
+    </w:p>
+    <w:p>
+      <w:pPr/>
+      <w:r>
+        <w:t>2. In Distributions, select the shared vertical interface. Confirm that the cyan highlight covers the internal edge between the blocks.</w:t>
+      </w:r>
+    </w:p>
+    <w:p>
+      <w:pPr/>
+      <w:r>
+        <w:t>3. Click Split Edge on the toolbar, then click near the middle of the highlighted interface. Alternatively, use Split Selected Edge at Coordinates and enter a point on the interface.</w:t>
+      </w:r>
+    </w:p>
+    <w:p>
+      <w:pPr/>
+      <w:r>
+        <w:t>4. The interface becomes two consecutive edges. Both blocks continue to use the same pair of edges, in opposite traversal directions, and their mesh status should remain OK. The split point adds a node; intervals are apportioned between the segments according to their lengths.</w:t>
+      </w:r>
+    </w:p>
+    <w:p>
+      <w:pPr/>
+      <w:r>
+        <w:t>5. In Distributions, select one of the two new interface segments. Set Nodes to 5 and click Apply to Selected.</w:t>
+      </w:r>
+    </w:p>
+    <w:p>
+      <w:pPr/>
+      <w:r>
+        <w:t>6. Check the Blocks panel. Both blocks should still report OK: the shared edge is used by both blocks, and the opposite side of each block is adjusted to match. If an opposite side contains several edges, intervals are distributed among them in proportion to their lengths.</w:t>
+      </w:r>
+    </w:p>
+    <w:p>
+      <w:pPr/>
+      <w:r>
+        <w:t>7. Click Generate Mesh. Confirm that both grids appear and meet along the split interface without a node-count mismatch.</w:t>
+      </w:r>
+    </w:p>
+    <w:p>
+      <w:pPr/>
+      <w:r>
+        <w:t>8. Choose File &gt; Save As and save the split-interface project under a new name, preserving the original baseline project.</w:t>
       </w:r>
     </w:p>
     <w:p>

</xml_diff>

<commit_message>
Merge nearby vertices by dragging
Add highlighted endpoint snapping and safe topology merges on drag release, with regression tests and updated manuals.

Co-authored-by: Copilot <223556219+Copilot@users.noreply.github.com>
</commit_message>
<xml_diff>
--- a/docs/MeshCAD_User_Manual.docx
+++ b/docs/MeshCAD_User_Manual.docx
@@ -1070,7 +1070,7 @@
         <w:t xml:space="preserve">• </w:t>
       </w:r>
       <w:r>
-        <w:t>Drag a red vertex to move every connected edge.</w:t>
+        <w:t>Drag a red vertex to move every connected edge. Drag it near another unconnected vertex and release to merge the endpoints; the target highlights in green while dragging. A merge that would collapse an existing edge is prevented.</w:t>
       </w:r>
     </w:p>
     <w:p>
@@ -1190,7 +1190,7 @@
         <w:t xml:space="preserve">3. </w:t>
       </w:r>
       <w:r>
-        <w:t>use snapping or double-click coordinate editing to make endpoints coincide;</w:t>
+        <w:t>drag one endpoint near the other and release to merge them, or use double-click coordinate editing to make their coordinates coincide;</w:t>
       </w:r>
     </w:p>
     <w:p>

</xml_diff>

<commit_message>
Add undo and redo for document edits
Track document operations in the undo stack and add edit-menu actions for undo and redo. Cover geometry, mesh settings, edge splits, patches, and project reset behavior with tests and updated manuals.

Co-authored-by: Copilot <223556219+Copilot@users.noreply.github.com>
</commit_message>
<xml_diff>
--- a/docs/MeshCAD_User_Manual.docx
+++ b/docs/MeshCAD_User_Manual.docx
@@ -88,6 +88,11 @@
       </w:r>
     </w:p>
     <w:p>
+      <w:r>
+        <w:t>Undo and Redo</w:t>
+      </w:r>
+    </w:p>
+    <w:p>
       <w:pPr>
         <w:spacing w:after="20"/>
         <w:ind w:left="0"/>
@@ -567,6 +572,15 @@
         <w:ind w:left="346" w:hanging="346"/>
       </w:pPr>
       <w:r>
+        <w:t>• Edit menu: Undo and Redo (Ctrl+Z / Ctrl+Y).</w:t>
+      </w:r>
+    </w:p>
+    <w:p>
+      <w:pPr>
+        <w:spacing w:after="60"/>
+        <w:ind w:left="346" w:hanging="346"/>
+      </w:pPr>
+      <w:r>
         <w:t xml:space="preserve">• </w:t>
       </w:r>
       <w:r>
@@ -690,6 +704,19 @@
     <w:p>
       <w:r>
         <w:t>Hold the pointer over a toolbar icon or parameter control to display its tooltip. The active drawing tool (Select, Line, Arc, or Spline) stays highlighted in the toolbar. Vertex and spline/arc grip markers keep a constant on-screen size as you zoom.</w:t>
+      </w:r>
+    </w:p>
+    <w:p>
+      <w:pPr>
+        <w:pStyle w:val="Heading1"/>
+      </w:pPr>
+      <w:r>
+        <w:t>Undo and Redo</w:t>
+      </w:r>
+    </w:p>
+    <w:p>
+      <w:r>
+        <w:t>Choose Edit &gt; Undo (Ctrl+Z) or Edit &gt; Redo (Ctrl+Y) to reverse or restore document edits. Geometry drawing, vertex drags and merges, edge splits, block edits, mesh distributions, boundary patches, and mesh options are recorded as actions. A drag is recorded as one action. Opening or creating a project clears the undo history.</w:t>
       </w:r>
     </w:p>
     <w:p>

</xml_diff>

<commit_message>
Improve toolbar layout and panel icons
Split the top toolbar into movable groups, add matching icons to edge, block, and patch actions, and document the new layout.

Co-authored-by: Copilot <223556219+Copilot@users.noreply.github.com>
</commit_message>
<xml_diff>
--- a/docs/MeshCAD_User_Manual.docx
+++ b/docs/MeshCAD_User_Manual.docx
@@ -590,7 +590,7 @@
         <w:t>Toolbar:</w:t>
       </w:r>
       <w:r>
-        <w:t xml:space="preserve"> Select, Line, Arc, Spline, Insert Point, Generate Mesh, Clear Mesh, Show Grid, Reset Zoom, and live mesh-improvement controls.</w:t>
+        <w:t xml:space="preserve"> Geometry on the first row; Mesh and View and Mesh Options share the second.</w:t>
       </w:r>
     </w:p>
     <w:p>
@@ -705,6 +705,10 @@
       <w:r>
         <w:t>Hold the pointer over a toolbar icon or parameter control to display its tooltip. The active drawing tool (Select, Line, Arc, or Spline) stays highlighted in the toolbar. Vertex and spline/arc grip markers keep a constant on-screen size as you zoom.</w:t>
       </w:r>
+      <w:r>
+        <w:t xml:space="preserve"> By default, Geometry is on the first row and Mesh and View and Mesh Options share the second. Drag a toolbar handle to reposition any toolbar.</w:t>
+      </w:r>
+      <w:r/>
     </w:p>
     <w:p>
       <w:pPr>

</xml_diff>